<commit_message>
completed PrintingExam and BatchingLogic
</commit_message>
<xml_diff>
--- a/template/template-full-essay-ai-scan.docx
+++ b/template/template-full-essay-ai-scan.docx
@@ -38,378 +38,2164 @@
       </w:r>
       <w:r>
         <w:tab/>
+        <w:t>Thời gian: {duration}</w:t>
       </w:r>
       <w:r>
-        <w:t>Thời gian: {duration}</w:t>
+        <w:tab/>
+      </w:r>
+      <w:r>
+        <w:tab/>
+        <w:t xml:space="preserve">Mã đề thi: {exam_code} </w:t>
       </w:r>
     </w:p>
     <w:tbl>
       <w:tblPr>
+        <w:tblStyle w:val="TableGrid"/>
         <w:tblW w:w="0" w:type="auto"/>
-        <w:jc w:val="center"/>
-        <w:tblLayout w:type="fixed"/>
+        <w:tblBorders>
+          <w:top w:val="none" w:sz="0" w:space="0" w:color="auto"/>
+          <w:left w:val="none" w:sz="0" w:space="0" w:color="auto"/>
+          <w:bottom w:val="none" w:sz="0" w:space="0" w:color="auto"/>
+          <w:right w:val="none" w:sz="0" w:space="0" w:color="auto"/>
+          <w:insideH w:val="none" w:sz="0" w:space="0" w:color="auto"/>
+          <w:insideV w:val="none" w:sz="0" w:space="0" w:color="auto"/>
+        </w:tblBorders>
         <w:tblLook w:val="04A0" w:firstRow="1" w:lastRow="0" w:firstColumn="1" w:lastColumn="0" w:noHBand="0" w:noVBand="1"/>
       </w:tblPr>
       <w:tblGrid>
-        <w:gridCol w:w="1701"/>
-        <w:gridCol w:w="3402"/>
-        <w:gridCol w:w="1701"/>
-        <w:gridCol w:w="2835"/>
+        <w:gridCol w:w="6487"/>
+        <w:gridCol w:w="4041"/>
       </w:tblGrid>
       <w:tr>
-        <w:trPr>
-          <w:jc w:val="center"/>
-        </w:trPr>
         <w:tc>
           <w:tcPr>
-            <w:tcW w:w="1701" w:type="dxa"/>
-            <w:tcBorders>
-              <w:top w:val="single" w:sz="10" w:space="0" w:color="AAB7C4"/>
-              <w:left w:val="single" w:sz="10" w:space="0" w:color="AAB7C4"/>
-              <w:bottom w:val="single" w:sz="10" w:space="0" w:color="AAB7C4"/>
-              <w:right w:val="single" w:sz="10" w:space="0" w:color="AAB7C4"/>
-            </w:tcBorders>
-            <w:shd w:val="clear" w:color="auto" w:fill="EAF2F8"/>
-            <w:tcMar>
-              <w:top w:w="80" w:type="dxa"/>
-              <w:left w:w="100" w:type="dxa"/>
-              <w:bottom w:w="80" w:type="dxa"/>
-              <w:right w:w="100" w:type="dxa"/>
-            </w:tcMar>
-            <w:vAlign w:val="center"/>
-          </w:tcPr>
-          <w:p>
-            <w:pPr>
-              <w:jc w:val="center"/>
-            </w:pPr>
-            <w:r>
-              <w:rPr>
-                <w:b/>
-                <w:sz w:val="20"/>
-              </w:rPr>
-              <w:t>STT</w:t>
-            </w:r>
-          </w:p>
-        </w:tc>
-        <w:tc>
-          <w:tcPr>
-            <w:tcW w:w="3402" w:type="dxa"/>
-            <w:tcBorders>
-              <w:top w:val="single" w:sz="10" w:space="0" w:color="AAB7C4"/>
-              <w:left w:val="single" w:sz="10" w:space="0" w:color="AAB7C4"/>
-              <w:bottom w:val="single" w:sz="10" w:space="0" w:color="AAB7C4"/>
-              <w:right w:val="single" w:sz="10" w:space="0" w:color="AAB7C4"/>
-            </w:tcBorders>
-            <w:shd w:val="clear" w:color="auto" w:fill="EAF2F8"/>
-            <w:tcMar>
-              <w:top w:w="80" w:type="dxa"/>
-              <w:left w:w="100" w:type="dxa"/>
-              <w:bottom w:w="80" w:type="dxa"/>
-              <w:right w:w="100" w:type="dxa"/>
-            </w:tcMar>
-            <w:vAlign w:val="center"/>
-          </w:tcPr>
-          <w:p>
-            <w:pPr>
-              <w:jc w:val="center"/>
-            </w:pPr>
-            <w:r>
-              <w:rPr>
-                <w:b/>
-                <w:sz w:val="20"/>
-              </w:rPr>
-              <w:t>Họ và tên</w:t>
-            </w:r>
-          </w:p>
-        </w:tc>
-        <w:tc>
-          <w:tcPr>
-            <w:tcW w:w="1701" w:type="dxa"/>
-            <w:tcBorders>
-              <w:top w:val="single" w:sz="10" w:space="0" w:color="AAB7C4"/>
-              <w:left w:val="single" w:sz="10" w:space="0" w:color="AAB7C4"/>
-              <w:bottom w:val="single" w:sz="10" w:space="0" w:color="AAB7C4"/>
-              <w:right w:val="single" w:sz="10" w:space="0" w:color="AAB7C4"/>
-            </w:tcBorders>
-            <w:shd w:val="clear" w:color="auto" w:fill="EAF2F8"/>
-            <w:tcMar>
-              <w:top w:w="80" w:type="dxa"/>
-              <w:left w:w="100" w:type="dxa"/>
-              <w:bottom w:w="80" w:type="dxa"/>
-              <w:right w:w="100" w:type="dxa"/>
-            </w:tcMar>
-            <w:vAlign w:val="center"/>
-          </w:tcPr>
-          <w:p>
-            <w:pPr>
-              <w:jc w:val="center"/>
-            </w:pPr>
-            <w:r>
-              <w:rPr>
-                <w:b/>
-                <w:sz w:val="20"/>
-              </w:rPr>
-              <w:t>MSSV</w:t>
-            </w:r>
-          </w:p>
-        </w:tc>
-        <w:tc>
-          <w:tcPr>
-            <w:tcW w:w="2835" w:type="dxa"/>
-            <w:tcBorders>
-              <w:top w:val="single" w:sz="10" w:space="0" w:color="AAB7C4"/>
-              <w:left w:val="single" w:sz="10" w:space="0" w:color="AAB7C4"/>
-              <w:bottom w:val="single" w:sz="10" w:space="0" w:color="AAB7C4"/>
-              <w:right w:val="single" w:sz="10" w:space="0" w:color="AAB7C4"/>
-            </w:tcBorders>
-            <w:shd w:val="clear" w:color="auto" w:fill="EAF2F8"/>
-            <w:tcMar>
-              <w:top w:w="80" w:type="dxa"/>
-              <w:left w:w="100" w:type="dxa"/>
-              <w:bottom w:w="80" w:type="dxa"/>
-              <w:right w:w="100" w:type="dxa"/>
-            </w:tcMar>
-            <w:vAlign w:val="center"/>
-          </w:tcPr>
-          <w:p>
-            <w:pPr>
-              <w:jc w:val="center"/>
-            </w:pPr>
-            <w:r>
-              <w:rPr>
-                <w:b/>
-                <w:sz w:val="20"/>
-              </w:rPr>
-              <w:t>Mã đề</w:t>
-            </w:r>
-          </w:p>
-        </w:tc>
-      </w:tr>
-      <w:tr>
-        <w:trPr>
-          <w:jc w:val="center"/>
-        </w:trPr>
-        <w:tc>
-          <w:tcPr>
-            <w:tcW w:w="1701" w:type="dxa"/>
-            <w:tcBorders>
-              <w:top w:val="single" w:sz="10" w:space="0" w:color="AAB7C4"/>
-              <w:left w:val="single" w:sz="10" w:space="0" w:color="AAB7C4"/>
-              <w:bottom w:val="single" w:sz="10" w:space="0" w:color="AAB7C4"/>
-              <w:right w:val="single" w:sz="10" w:space="0" w:color="AAB7C4"/>
-            </w:tcBorders>
-            <w:tcMar>
-              <w:top w:w="80" w:type="dxa"/>
-              <w:left w:w="100" w:type="dxa"/>
-              <w:bottom w:w="80" w:type="dxa"/>
-              <w:right w:w="100" w:type="dxa"/>
-            </w:tcMar>
-            <w:vAlign w:val="center"/>
-          </w:tcPr>
-          <w:p>
-            <w:pPr>
-              <w:jc w:val="center"/>
-            </w:pPr>
-            <w:r>
-              <w:rPr>
-                <w:sz w:val="20"/>
-              </w:rPr>
-              <w:t>{student_order}</w:t>
-            </w:r>
-          </w:p>
-        </w:tc>
-        <w:tc>
-          <w:tcPr>
-            <w:tcW w:w="3402" w:type="dxa"/>
-            <w:tcBorders>
-              <w:top w:val="single" w:sz="10" w:space="0" w:color="AAB7C4"/>
-              <w:left w:val="single" w:sz="10" w:space="0" w:color="AAB7C4"/>
-              <w:bottom w:val="single" w:sz="10" w:space="0" w:color="AAB7C4"/>
-              <w:right w:val="single" w:sz="10" w:space="0" w:color="AAB7C4"/>
-            </w:tcBorders>
-            <w:tcMar>
-              <w:top w:w="80" w:type="dxa"/>
-              <w:left w:w="100" w:type="dxa"/>
-              <w:bottom w:w="80" w:type="dxa"/>
-              <w:right w:w="100" w:type="dxa"/>
-            </w:tcMar>
-            <w:vAlign w:val="center"/>
-          </w:tcPr>
-          <w:p>
-            <w:pPr>
-              <w:jc w:val="center"/>
-            </w:pPr>
-            <w:r>
-              <w:rPr>
-                <w:sz w:val="20"/>
-              </w:rPr>
-              <w:t>{student_name}</w:t>
-            </w:r>
-          </w:p>
-        </w:tc>
-        <w:tc>
-          <w:tcPr>
-            <w:tcW w:w="1701" w:type="dxa"/>
-            <w:tcBorders>
-              <w:top w:val="single" w:sz="10" w:space="0" w:color="AAB7C4"/>
-              <w:left w:val="single" w:sz="10" w:space="0" w:color="AAB7C4"/>
-              <w:bottom w:val="single" w:sz="10" w:space="0" w:color="AAB7C4"/>
-              <w:right w:val="single" w:sz="10" w:space="0" w:color="AAB7C4"/>
-            </w:tcBorders>
-            <w:tcMar>
-              <w:top w:w="80" w:type="dxa"/>
-              <w:left w:w="100" w:type="dxa"/>
-              <w:bottom w:w="80" w:type="dxa"/>
-              <w:right w:w="100" w:type="dxa"/>
-            </w:tcMar>
-            <w:vAlign w:val="center"/>
-          </w:tcPr>
-          <w:p>
-            <w:pPr>
-              <w:jc w:val="center"/>
-            </w:pPr>
-            <w:r>
-              <w:rPr>
-                <w:sz w:val="20"/>
-              </w:rPr>
-              <w:t>{student_id}</w:t>
-            </w:r>
-          </w:p>
-        </w:tc>
-        <w:tc>
-          <w:tcPr>
-            <w:tcW w:w="2835" w:type="dxa"/>
-            <w:tcBorders>
-              <w:top w:val="single" w:sz="10" w:space="0" w:color="AAB7C4"/>
-              <w:left w:val="single" w:sz="10" w:space="0" w:color="AAB7C4"/>
-              <w:bottom w:val="single" w:sz="10" w:space="0" w:color="AAB7C4"/>
-              <w:right w:val="single" w:sz="10" w:space="0" w:color="AAB7C4"/>
-            </w:tcBorders>
-            <w:tcMar>
-              <w:top w:w="80" w:type="dxa"/>
-              <w:left w:w="100" w:type="dxa"/>
-              <w:bottom w:w="80" w:type="dxa"/>
-              <w:right w:w="100" w:type="dxa"/>
-            </w:tcMar>
-            <w:vAlign w:val="center"/>
-          </w:tcPr>
-          <w:p>
-            <w:pPr>
-              <w:jc w:val="center"/>
-            </w:pPr>
-            <w:r>
-              <w:rPr>
-                <w:sz w:val="20"/>
-              </w:rPr>
-              <w:t>{exam_code}</w:t>
-            </w:r>
-          </w:p>
-        </w:tc>
-      </w:tr>
-    </w:tbl>
-    <w:p/>
-    <w:tbl>
-      <w:tblPr>
-        <w:tblW w:w="0" w:type="auto"/>
-        <w:jc w:val="center"/>
-        <w:tblLayout w:type="fixed"/>
-        <w:tblLook w:val="04A0" w:firstRow="1" w:lastRow="0" w:firstColumn="1" w:lastColumn="0" w:noHBand="0" w:noVBand="1"/>
-      </w:tblPr>
-      <w:tblGrid>
-        <w:gridCol w:w="10312"/>
-      </w:tblGrid>
-      <w:tr>
-        <w:trPr>
-          <w:jc w:val="center"/>
-        </w:trPr>
-        <w:tc>
-          <w:tcPr>
-            <w:tcW w:w="10312" w:type="dxa"/>
-            <w:tcBorders>
-              <w:top w:val="single" w:sz="10" w:space="0" w:color="C8D3DC"/>
-              <w:left w:val="single" w:sz="10" w:space="0" w:color="C8D3DC"/>
-              <w:bottom w:val="single" w:sz="10" w:space="0" w:color="C8D3DC"/>
-              <w:right w:val="single" w:sz="10" w:space="0" w:color="C8D3DC"/>
-            </w:tcBorders>
-            <w:shd w:val="clear" w:color="auto" w:fill="F7FAFC"/>
-            <w:tcMar>
-              <w:top w:w="120" w:type="dxa"/>
-              <w:left w:w="150" w:type="dxa"/>
-              <w:bottom w:w="120" w:type="dxa"/>
-              <w:right w:w="150" w:type="dxa"/>
-            </w:tcMar>
+            <w:tcW w:w="6487" w:type="dxa"/>
           </w:tcPr>
           <w:p>
             <w:r>
               <w:rPr>
                 <w:b/>
+                <w:bCs/>
               </w:rPr>
-              <w:t>Hướng dẫn làm bài</w:t>
+              <w:t xml:space="preserve">Họ và tên: </w:t>
+            </w:r>
+            <w:r>
+              <w:t>…………………………………………………………….</w:t>
             </w:r>
           </w:p>
           <w:p>
+            <w:r>
+              <w:rPr>
+                <w:b/>
+                <w:bCs/>
+              </w:rPr>
+              <w:t>Mã lớp:</w:t>
+            </w:r>
+            <w:r>
+              <w:t xml:space="preserve"> ………………………………………………………………..</w:t>
+            </w:r>
+          </w:p>
+          <w:p>
+            <w:r>
+              <w:rPr>
+                <w:b/>
+                <w:bCs/>
+              </w:rPr>
+              <w:t xml:space="preserve">Ngày sinh: </w:t>
+            </w:r>
+            <w:r>
+              <w:t xml:space="preserve">……………………………………… </w:t>
+            </w:r>
+            <w:r>
+              <w:rPr>
+                <w:b/>
+                <w:bCs/>
+              </w:rPr>
+              <w:t xml:space="preserve">Giới tính: </w:t>
+            </w:r>
+            <w:r>
+              <w:t>………</w:t>
+            </w:r>
+          </w:p>
+          <w:p>
+            <w:r>
+              <w:rPr>
+                <w:b/>
+                <w:bCs/>
+              </w:rPr>
+              <w:t xml:space="preserve">Phòng thi: </w:t>
+            </w:r>
+            <w:r>
+              <w:t xml:space="preserve">……………………………………… </w:t>
+            </w:r>
+            <w:r>
+              <w:rPr>
+                <w:b/>
+                <w:bCs/>
+              </w:rPr>
+              <w:t xml:space="preserve">STT: </w:t>
+            </w:r>
+            <w:r>
+              <w:t>…………….</w:t>
+            </w:r>
+          </w:p>
+          <w:tbl>
+            <w:tblPr>
+              <w:tblW w:w="0" w:type="auto"/>
+              <w:tblLayout w:type="fixed"/>
+              <w:tblLook w:val="04A0" w:firstRow="1" w:lastRow="0" w:firstColumn="1" w:lastColumn="0" w:noHBand="0" w:noVBand="1"/>
+            </w:tblPr>
+            <w:tblGrid>
+              <w:gridCol w:w="6104"/>
+            </w:tblGrid>
+            <w:tr>
+              <w:trPr>
+                <w:trHeight w:val="2887"/>
+              </w:trPr>
+              <w:tc>
+                <w:tcPr>
+                  <w:tcW w:w="6104" w:type="dxa"/>
+                  <w:tcBorders>
+                    <w:top w:val="single" w:sz="10" w:space="0" w:color="C8D3DC"/>
+                    <w:left w:val="single" w:sz="10" w:space="0" w:color="C8D3DC"/>
+                    <w:bottom w:val="single" w:sz="10" w:space="0" w:color="C8D3DC"/>
+                    <w:right w:val="single" w:sz="10" w:space="0" w:color="C8D3DC"/>
+                  </w:tcBorders>
+                  <w:shd w:val="clear" w:color="auto" w:fill="F7FAFC"/>
+                  <w:tcMar>
+                    <w:top w:w="120" w:type="dxa"/>
+                    <w:left w:w="150" w:type="dxa"/>
+                    <w:bottom w:w="120" w:type="dxa"/>
+                    <w:right w:w="150" w:type="dxa"/>
+                  </w:tcMar>
+                  <w:vAlign w:val="center"/>
+                </w:tcPr>
+                <w:p>
+                  <w:pPr>
+                    <w:jc w:val="both"/>
+                  </w:pPr>
+                  <w:r>
+                    <w:rPr>
+                      <w:b/>
+                      <w:bCs/>
+                    </w:rPr>
+                    <w:t>HƯỚNG DẪN LÀM BÀI</w:t>
+                  </w:r>
+                </w:p>
+                <w:p>
+                  <w:pPr>
+                    <w:jc w:val="both"/>
+                  </w:pPr>
+                  <w:r>
+                    <w:rPr>
+                      <w:b/>
+                      <w:bCs/>
+                    </w:rPr>
+                    <w:t xml:space="preserve">- </w:t>
+                  </w:r>
+                  <w:r>
+                    <w:rPr>
+                      <w:b/>
+                      <w:bCs/>
+                    </w:rPr>
+                    <w:t>Thông tin cá nhân &amp; M</w:t>
+                  </w:r>
+                  <w:r>
+                    <w:rPr>
+                      <w:b/>
+                      <w:bCs/>
+                    </w:rPr>
+                    <w:t>SSV</w:t>
+                  </w:r>
+                  <w:r>
+                    <w:rPr>
+                      <w:b/>
+                      <w:bCs/>
+                    </w:rPr>
+                    <w:t>:</w:t>
+                  </w:r>
+                  <w:r>
+                    <w:t xml:space="preserve"> Điền đầy đủ thông tin cá nhân vào các mục quy định. Đặc biệt, phải ghi rõ bằng số và </w:t>
+                  </w:r>
+                  <w:r>
+                    <w:rPr>
+                      <w:b/>
+                      <w:bCs/>
+                    </w:rPr>
+                    <w:t xml:space="preserve">tô kín các ô tròn tương ứng với </w:t>
+                  </w:r>
+                  <w:r>
+                    <w:rPr>
+                      <w:b/>
+                      <w:bCs/>
+                    </w:rPr>
+                    <w:t>MSSV.</w:t>
+                  </w:r>
+                </w:p>
+                <w:p>
+                  <w:pPr>
+                    <w:jc w:val="both"/>
+                  </w:pPr>
+                  <w:r>
+                    <w:rPr>
+                      <w:b/>
+                      <w:bCs/>
+                    </w:rPr>
+                    <w:t xml:space="preserve">- </w:t>
+                  </w:r>
+                  <w:r>
+                    <w:rPr>
+                      <w:b/>
+                      <w:bCs/>
+                    </w:rPr>
+                    <w:t>Phần trắc nghiệm:</w:t>
+                  </w:r>
+                  <w:r>
+                    <w:t xml:space="preserve"> Tô kín hoặc đánh dấu rõ ràng duy nhất một ô A, B, C hoặc D cho mỗi câu hỏi.</w:t>
+                  </w:r>
+                </w:p>
+                <w:p>
+                  <w:pPr>
+                    <w:jc w:val="both"/>
+                  </w:pPr>
+                  <w:r>
+                    <w:rPr>
+                      <w:b/>
+                      <w:bCs/>
+                    </w:rPr>
+                    <w:t xml:space="preserve">- </w:t>
+                  </w:r>
+                  <w:r>
+                    <w:rPr>
+                      <w:b/>
+                      <w:bCs/>
+                    </w:rPr>
+                    <w:t>Phần tự luận:</w:t>
+                  </w:r>
+                  <w:r>
+                    <w:t xml:space="preserve"> Chỉ trình bày bài làm bên trong khung dành riêng cho từng câu. Tuyệt đối không viết ra ngoài khung (phần viết ra ngoài sẽ không thể nhận diện để chấm điểm).</w:t>
+                  </w:r>
+                </w:p>
+              </w:tc>
+            </w:tr>
+          </w:tbl>
+          <w:p>
             <w:pPr>
-              <w:ind w:left="283"/>
+              <w:rPr>
+                <w:b/>
+                <w:bCs/>
+              </w:rPr>
+            </w:pPr>
+          </w:p>
+        </w:tc>
+        <w:tc>
+          <w:tcPr>
+            <w:tcW w:w="4041" w:type="dxa"/>
+          </w:tcPr>
+          <w:p>
+            <w:pPr>
+              <w:rPr>
+                <w:b/>
+                <w:bCs/>
+              </w:rPr>
             </w:pPr>
             <w:r>
               <w:rPr>
-                <w:sz w:val="20"/>
+                <w:b/>
+                <w:bCs/>
               </w:rPr>
-              <w:t>• Điền đầy đủ STT, Họ và tên, MSSV, Mã đề ở đầu phiếu.</w:t>
+              <w:t>MSSV:</w:t>
             </w:r>
           </w:p>
+          <w:tbl>
+            <w:tblPr>
+              <w:tblStyle w:val="TableGrid"/>
+              <w:tblW w:w="0" w:type="auto"/>
+              <w:tblLook w:val="04A0" w:firstRow="1" w:lastRow="0" w:firstColumn="1" w:lastColumn="0" w:noHBand="0" w:noVBand="1"/>
+            </w:tblPr>
+            <w:tblGrid>
+              <w:gridCol w:w="476"/>
+              <w:gridCol w:w="476"/>
+              <w:gridCol w:w="476"/>
+              <w:gridCol w:w="476"/>
+              <w:gridCol w:w="476"/>
+              <w:gridCol w:w="476"/>
+              <w:gridCol w:w="477"/>
+              <w:gridCol w:w="477"/>
+            </w:tblGrid>
+            <w:tr>
+              <w:trPr>
+                <w:trHeight w:val="440"/>
+              </w:trPr>
+              <w:tc>
+                <w:tcPr>
+                  <w:tcW w:w="476" w:type="dxa"/>
+                </w:tcPr>
+                <w:p>
+                  <w:pPr>
+                    <w:rPr>
+                      <w:b/>
+                      <w:bCs/>
+                      <w:sz w:val="24"/>
+                      <w:szCs w:val="24"/>
+                    </w:rPr>
+                  </w:pPr>
+                </w:p>
+              </w:tc>
+              <w:tc>
+                <w:tcPr>
+                  <w:tcW w:w="476" w:type="dxa"/>
+                </w:tcPr>
+                <w:p>
+                  <w:pPr>
+                    <w:rPr>
+                      <w:b/>
+                      <w:bCs/>
+                      <w:sz w:val="24"/>
+                      <w:szCs w:val="24"/>
+                    </w:rPr>
+                  </w:pPr>
+                </w:p>
+              </w:tc>
+              <w:tc>
+                <w:tcPr>
+                  <w:tcW w:w="476" w:type="dxa"/>
+                </w:tcPr>
+                <w:p>
+                  <w:pPr>
+                    <w:rPr>
+                      <w:b/>
+                      <w:bCs/>
+                      <w:sz w:val="24"/>
+                      <w:szCs w:val="24"/>
+                    </w:rPr>
+                  </w:pPr>
+                </w:p>
+              </w:tc>
+              <w:tc>
+                <w:tcPr>
+                  <w:tcW w:w="476" w:type="dxa"/>
+                </w:tcPr>
+                <w:p>
+                  <w:pPr>
+                    <w:rPr>
+                      <w:b/>
+                      <w:bCs/>
+                      <w:sz w:val="24"/>
+                      <w:szCs w:val="24"/>
+                    </w:rPr>
+                  </w:pPr>
+                </w:p>
+              </w:tc>
+              <w:tc>
+                <w:tcPr>
+                  <w:tcW w:w="476" w:type="dxa"/>
+                </w:tcPr>
+                <w:p>
+                  <w:pPr>
+                    <w:rPr>
+                      <w:b/>
+                      <w:bCs/>
+                      <w:sz w:val="24"/>
+                      <w:szCs w:val="24"/>
+                    </w:rPr>
+                  </w:pPr>
+                </w:p>
+              </w:tc>
+              <w:tc>
+                <w:tcPr>
+                  <w:tcW w:w="476" w:type="dxa"/>
+                </w:tcPr>
+                <w:p>
+                  <w:pPr>
+                    <w:rPr>
+                      <w:b/>
+                      <w:bCs/>
+                      <w:sz w:val="24"/>
+                      <w:szCs w:val="24"/>
+                    </w:rPr>
+                  </w:pPr>
+                </w:p>
+              </w:tc>
+              <w:tc>
+                <w:tcPr>
+                  <w:tcW w:w="477" w:type="dxa"/>
+                </w:tcPr>
+                <w:p>
+                  <w:pPr>
+                    <w:rPr>
+                      <w:b/>
+                      <w:bCs/>
+                      <w:sz w:val="24"/>
+                      <w:szCs w:val="24"/>
+                    </w:rPr>
+                  </w:pPr>
+                </w:p>
+              </w:tc>
+              <w:tc>
+                <w:tcPr>
+                  <w:tcW w:w="477" w:type="dxa"/>
+                </w:tcPr>
+                <w:p>
+                  <w:pPr>
+                    <w:rPr>
+                      <w:b/>
+                      <w:bCs/>
+                      <w:sz w:val="24"/>
+                      <w:szCs w:val="24"/>
+                    </w:rPr>
+                  </w:pPr>
+                </w:p>
+              </w:tc>
+            </w:tr>
+            <w:tr>
+              <w:trPr>
+                <w:trHeight w:val="3305"/>
+              </w:trPr>
+              <w:tc>
+                <w:tcPr>
+                  <w:tcW w:w="476" w:type="dxa"/>
+                </w:tcPr>
+                <w:p>
+                  <w:pPr>
+                    <w:rPr>
+                      <w:b/>
+                      <w:bCs/>
+                      <w:sz w:val="24"/>
+                      <w:szCs w:val="24"/>
+                    </w:rPr>
+                  </w:pPr>
+                  <w:r>
+                    <w:rPr>
+                      <w:rFonts w:hint="eastAsia"/>
+                      <w:b/>
+                      <w:bCs/>
+                      <w:sz w:val="24"/>
+                      <w:szCs w:val="24"/>
+                    </w:rPr>
+                    <w:t>⓪</w:t>
+                  </w:r>
+                </w:p>
+                <w:p>
+                  <w:pPr>
+                    <w:rPr>
+                      <w:b/>
+                      <w:bCs/>
+                      <w:sz w:val="24"/>
+                      <w:szCs w:val="24"/>
+                    </w:rPr>
+                  </w:pPr>
+                  <w:r>
+                    <w:rPr>
+                      <w:rFonts w:hint="eastAsia"/>
+                      <w:b/>
+                      <w:bCs/>
+                      <w:sz w:val="24"/>
+                      <w:szCs w:val="24"/>
+                    </w:rPr>
+                    <w:t>①</w:t>
+                  </w:r>
+                </w:p>
+                <w:p>
+                  <w:pPr>
+                    <w:rPr>
+                      <w:b/>
+                      <w:bCs/>
+                      <w:sz w:val="24"/>
+                      <w:szCs w:val="24"/>
+                    </w:rPr>
+                  </w:pPr>
+                  <w:r>
+                    <w:rPr>
+                      <w:rFonts w:hint="eastAsia"/>
+                      <w:b/>
+                      <w:bCs/>
+                      <w:sz w:val="24"/>
+                      <w:szCs w:val="24"/>
+                    </w:rPr>
+                    <w:t>②</w:t>
+                  </w:r>
+                </w:p>
+                <w:p>
+                  <w:pPr>
+                    <w:rPr>
+                      <w:b/>
+                      <w:bCs/>
+                      <w:sz w:val="24"/>
+                      <w:szCs w:val="24"/>
+                    </w:rPr>
+                  </w:pPr>
+                  <w:r>
+                    <w:rPr>
+                      <w:rFonts w:hint="eastAsia"/>
+                      <w:b/>
+                      <w:bCs/>
+                      <w:sz w:val="24"/>
+                      <w:szCs w:val="24"/>
+                    </w:rPr>
+                    <w:t>③</w:t>
+                  </w:r>
+                </w:p>
+                <w:p>
+                  <w:pPr>
+                    <w:rPr>
+                      <w:b/>
+                      <w:bCs/>
+                      <w:sz w:val="24"/>
+                      <w:szCs w:val="24"/>
+                    </w:rPr>
+                  </w:pPr>
+                  <w:r>
+                    <w:rPr>
+                      <w:rFonts w:hint="eastAsia"/>
+                      <w:b/>
+                      <w:bCs/>
+                      <w:sz w:val="24"/>
+                      <w:szCs w:val="24"/>
+                    </w:rPr>
+                    <w:t>④</w:t>
+                  </w:r>
+                </w:p>
+                <w:p>
+                  <w:pPr>
+                    <w:rPr>
+                      <w:b/>
+                      <w:bCs/>
+                      <w:sz w:val="24"/>
+                      <w:szCs w:val="24"/>
+                    </w:rPr>
+                  </w:pPr>
+                  <w:r>
+                    <w:rPr>
+                      <w:rFonts w:hint="eastAsia"/>
+                      <w:b/>
+                      <w:bCs/>
+                      <w:sz w:val="24"/>
+                      <w:szCs w:val="24"/>
+                    </w:rPr>
+                    <w:t>⑤</w:t>
+                  </w:r>
+                </w:p>
+                <w:p>
+                  <w:pPr>
+                    <w:rPr>
+                      <w:b/>
+                      <w:bCs/>
+                      <w:sz w:val="24"/>
+                      <w:szCs w:val="24"/>
+                    </w:rPr>
+                  </w:pPr>
+                  <w:r>
+                    <w:rPr>
+                      <w:rFonts w:hint="eastAsia"/>
+                      <w:b/>
+                      <w:bCs/>
+                      <w:sz w:val="24"/>
+                      <w:szCs w:val="24"/>
+                    </w:rPr>
+                    <w:t>⑥</w:t>
+                  </w:r>
+                </w:p>
+                <w:p>
+                  <w:pPr>
+                    <w:rPr>
+                      <w:b/>
+                      <w:bCs/>
+                      <w:sz w:val="24"/>
+                      <w:szCs w:val="24"/>
+                    </w:rPr>
+                  </w:pPr>
+                  <w:r>
+                    <w:rPr>
+                      <w:rFonts w:hint="eastAsia"/>
+                      <w:b/>
+                      <w:bCs/>
+                      <w:sz w:val="24"/>
+                      <w:szCs w:val="24"/>
+                    </w:rPr>
+                    <w:t>⑦</w:t>
+                  </w:r>
+                </w:p>
+                <w:p>
+                  <w:pPr>
+                    <w:rPr>
+                      <w:b/>
+                      <w:bCs/>
+                      <w:sz w:val="24"/>
+                      <w:szCs w:val="24"/>
+                    </w:rPr>
+                  </w:pPr>
+                  <w:r>
+                    <w:rPr>
+                      <w:rFonts w:hint="eastAsia"/>
+                      <w:b/>
+                      <w:bCs/>
+                      <w:sz w:val="24"/>
+                      <w:szCs w:val="24"/>
+                    </w:rPr>
+                    <w:t>⑧</w:t>
+                  </w:r>
+                </w:p>
+                <w:p>
+                  <w:pPr>
+                    <w:rPr>
+                      <w:b/>
+                      <w:bCs/>
+                      <w:sz w:val="24"/>
+                      <w:szCs w:val="24"/>
+                    </w:rPr>
+                  </w:pPr>
+                  <w:r>
+                    <w:rPr>
+                      <w:rFonts w:hint="eastAsia"/>
+                      <w:b/>
+                      <w:bCs/>
+                      <w:sz w:val="24"/>
+                      <w:szCs w:val="24"/>
+                    </w:rPr>
+                    <w:t>⑨</w:t>
+                  </w:r>
+                </w:p>
+              </w:tc>
+              <w:tc>
+                <w:tcPr>
+                  <w:tcW w:w="476" w:type="dxa"/>
+                </w:tcPr>
+                <w:p>
+                  <w:pPr>
+                    <w:rPr>
+                      <w:b/>
+                      <w:bCs/>
+                      <w:sz w:val="24"/>
+                      <w:szCs w:val="24"/>
+                    </w:rPr>
+                  </w:pPr>
+                  <w:r>
+                    <w:rPr>
+                      <w:rFonts w:hint="eastAsia"/>
+                      <w:b/>
+                      <w:bCs/>
+                      <w:sz w:val="24"/>
+                      <w:szCs w:val="24"/>
+                    </w:rPr>
+                    <w:t>⓪</w:t>
+                  </w:r>
+                </w:p>
+                <w:p>
+                  <w:pPr>
+                    <w:rPr>
+                      <w:b/>
+                      <w:bCs/>
+                      <w:sz w:val="24"/>
+                      <w:szCs w:val="24"/>
+                    </w:rPr>
+                  </w:pPr>
+                  <w:r>
+                    <w:rPr>
+                      <w:rFonts w:hint="eastAsia"/>
+                      <w:b/>
+                      <w:bCs/>
+                      <w:sz w:val="24"/>
+                      <w:szCs w:val="24"/>
+                    </w:rPr>
+                    <w:t>①</w:t>
+                  </w:r>
+                </w:p>
+                <w:p>
+                  <w:pPr>
+                    <w:rPr>
+                      <w:b/>
+                      <w:bCs/>
+                      <w:sz w:val="24"/>
+                      <w:szCs w:val="24"/>
+                    </w:rPr>
+                  </w:pPr>
+                  <w:r>
+                    <w:rPr>
+                      <w:rFonts w:hint="eastAsia"/>
+                      <w:b/>
+                      <w:bCs/>
+                      <w:sz w:val="24"/>
+                      <w:szCs w:val="24"/>
+                    </w:rPr>
+                    <w:t>②</w:t>
+                  </w:r>
+                </w:p>
+                <w:p>
+                  <w:pPr>
+                    <w:rPr>
+                      <w:b/>
+                      <w:bCs/>
+                      <w:sz w:val="24"/>
+                      <w:szCs w:val="24"/>
+                    </w:rPr>
+                  </w:pPr>
+                  <w:r>
+                    <w:rPr>
+                      <w:rFonts w:hint="eastAsia"/>
+                      <w:b/>
+                      <w:bCs/>
+                      <w:sz w:val="24"/>
+                      <w:szCs w:val="24"/>
+                    </w:rPr>
+                    <w:t>③</w:t>
+                  </w:r>
+                </w:p>
+                <w:p>
+                  <w:pPr>
+                    <w:rPr>
+                      <w:b/>
+                      <w:bCs/>
+                      <w:sz w:val="24"/>
+                      <w:szCs w:val="24"/>
+                    </w:rPr>
+                  </w:pPr>
+                  <w:r>
+                    <w:rPr>
+                      <w:rFonts w:hint="eastAsia"/>
+                      <w:b/>
+                      <w:bCs/>
+                      <w:sz w:val="24"/>
+                      <w:szCs w:val="24"/>
+                    </w:rPr>
+                    <w:t>④</w:t>
+                  </w:r>
+                </w:p>
+                <w:p>
+                  <w:pPr>
+                    <w:rPr>
+                      <w:b/>
+                      <w:bCs/>
+                      <w:sz w:val="24"/>
+                      <w:szCs w:val="24"/>
+                    </w:rPr>
+                  </w:pPr>
+                  <w:r>
+                    <w:rPr>
+                      <w:rFonts w:hint="eastAsia"/>
+                      <w:b/>
+                      <w:bCs/>
+                      <w:sz w:val="24"/>
+                      <w:szCs w:val="24"/>
+                    </w:rPr>
+                    <w:t>⑤</w:t>
+                  </w:r>
+                </w:p>
+                <w:p>
+                  <w:pPr>
+                    <w:rPr>
+                      <w:b/>
+                      <w:bCs/>
+                      <w:sz w:val="24"/>
+                      <w:szCs w:val="24"/>
+                    </w:rPr>
+                  </w:pPr>
+                  <w:r>
+                    <w:rPr>
+                      <w:rFonts w:hint="eastAsia"/>
+                      <w:b/>
+                      <w:bCs/>
+                      <w:sz w:val="24"/>
+                      <w:szCs w:val="24"/>
+                    </w:rPr>
+                    <w:t>⑥</w:t>
+                  </w:r>
+                </w:p>
+                <w:p>
+                  <w:pPr>
+                    <w:rPr>
+                      <w:b/>
+                      <w:bCs/>
+                      <w:sz w:val="24"/>
+                      <w:szCs w:val="24"/>
+                    </w:rPr>
+                  </w:pPr>
+                  <w:r>
+                    <w:rPr>
+                      <w:rFonts w:hint="eastAsia"/>
+                      <w:b/>
+                      <w:bCs/>
+                      <w:sz w:val="24"/>
+                      <w:szCs w:val="24"/>
+                    </w:rPr>
+                    <w:t>⑦</w:t>
+                  </w:r>
+                </w:p>
+                <w:p>
+                  <w:pPr>
+                    <w:rPr>
+                      <w:b/>
+                      <w:bCs/>
+                      <w:sz w:val="24"/>
+                      <w:szCs w:val="24"/>
+                    </w:rPr>
+                  </w:pPr>
+                  <w:r>
+                    <w:rPr>
+                      <w:rFonts w:hint="eastAsia"/>
+                      <w:b/>
+                      <w:bCs/>
+                      <w:sz w:val="24"/>
+                      <w:szCs w:val="24"/>
+                    </w:rPr>
+                    <w:t>⑧</w:t>
+                  </w:r>
+                </w:p>
+                <w:p>
+                  <w:pPr>
+                    <w:rPr>
+                      <w:b/>
+                      <w:bCs/>
+                      <w:sz w:val="24"/>
+                      <w:szCs w:val="24"/>
+                    </w:rPr>
+                  </w:pPr>
+                  <w:r>
+                    <w:rPr>
+                      <w:rFonts w:hint="eastAsia"/>
+                      <w:b/>
+                      <w:bCs/>
+                      <w:sz w:val="24"/>
+                      <w:szCs w:val="24"/>
+                    </w:rPr>
+                    <w:t>⑨</w:t>
+                  </w:r>
+                </w:p>
+              </w:tc>
+              <w:tc>
+                <w:tcPr>
+                  <w:tcW w:w="476" w:type="dxa"/>
+                </w:tcPr>
+                <w:p>
+                  <w:pPr>
+                    <w:rPr>
+                      <w:b/>
+                      <w:bCs/>
+                      <w:sz w:val="24"/>
+                      <w:szCs w:val="24"/>
+                    </w:rPr>
+                  </w:pPr>
+                  <w:r>
+                    <w:rPr>
+                      <w:rFonts w:hint="eastAsia"/>
+                      <w:b/>
+                      <w:bCs/>
+                      <w:sz w:val="24"/>
+                      <w:szCs w:val="24"/>
+                    </w:rPr>
+                    <w:t>⓪</w:t>
+                  </w:r>
+                </w:p>
+                <w:p>
+                  <w:pPr>
+                    <w:rPr>
+                      <w:b/>
+                      <w:bCs/>
+                      <w:sz w:val="24"/>
+                      <w:szCs w:val="24"/>
+                    </w:rPr>
+                  </w:pPr>
+                  <w:r>
+                    <w:rPr>
+                      <w:rFonts w:hint="eastAsia"/>
+                      <w:b/>
+                      <w:bCs/>
+                      <w:sz w:val="24"/>
+                      <w:szCs w:val="24"/>
+                    </w:rPr>
+                    <w:t>①</w:t>
+                  </w:r>
+                </w:p>
+                <w:p>
+                  <w:pPr>
+                    <w:rPr>
+                      <w:b/>
+                      <w:bCs/>
+                      <w:sz w:val="24"/>
+                      <w:szCs w:val="24"/>
+                    </w:rPr>
+                  </w:pPr>
+                  <w:r>
+                    <w:rPr>
+                      <w:rFonts w:hint="eastAsia"/>
+                      <w:b/>
+                      <w:bCs/>
+                      <w:sz w:val="24"/>
+                      <w:szCs w:val="24"/>
+                    </w:rPr>
+                    <w:t>②</w:t>
+                  </w:r>
+                </w:p>
+                <w:p>
+                  <w:pPr>
+                    <w:rPr>
+                      <w:b/>
+                      <w:bCs/>
+                      <w:sz w:val="24"/>
+                      <w:szCs w:val="24"/>
+                    </w:rPr>
+                  </w:pPr>
+                  <w:r>
+                    <w:rPr>
+                      <w:rFonts w:hint="eastAsia"/>
+                      <w:b/>
+                      <w:bCs/>
+                      <w:sz w:val="24"/>
+                      <w:szCs w:val="24"/>
+                    </w:rPr>
+                    <w:t>③</w:t>
+                  </w:r>
+                </w:p>
+                <w:p>
+                  <w:pPr>
+                    <w:rPr>
+                      <w:b/>
+                      <w:bCs/>
+                      <w:sz w:val="24"/>
+                      <w:szCs w:val="24"/>
+                    </w:rPr>
+                  </w:pPr>
+                  <w:r>
+                    <w:rPr>
+                      <w:rFonts w:hint="eastAsia"/>
+                      <w:b/>
+                      <w:bCs/>
+                      <w:sz w:val="24"/>
+                      <w:szCs w:val="24"/>
+                    </w:rPr>
+                    <w:t>④</w:t>
+                  </w:r>
+                </w:p>
+                <w:p>
+                  <w:pPr>
+                    <w:rPr>
+                      <w:b/>
+                      <w:bCs/>
+                      <w:sz w:val="24"/>
+                      <w:szCs w:val="24"/>
+                    </w:rPr>
+                  </w:pPr>
+                  <w:r>
+                    <w:rPr>
+                      <w:rFonts w:hint="eastAsia"/>
+                      <w:b/>
+                      <w:bCs/>
+                      <w:sz w:val="24"/>
+                      <w:szCs w:val="24"/>
+                    </w:rPr>
+                    <w:t>⑤</w:t>
+                  </w:r>
+                </w:p>
+                <w:p>
+                  <w:pPr>
+                    <w:rPr>
+                      <w:b/>
+                      <w:bCs/>
+                      <w:sz w:val="24"/>
+                      <w:szCs w:val="24"/>
+                    </w:rPr>
+                  </w:pPr>
+                  <w:r>
+                    <w:rPr>
+                      <w:rFonts w:hint="eastAsia"/>
+                      <w:b/>
+                      <w:bCs/>
+                      <w:sz w:val="24"/>
+                      <w:szCs w:val="24"/>
+                    </w:rPr>
+                    <w:t>⑥</w:t>
+                  </w:r>
+                </w:p>
+                <w:p>
+                  <w:pPr>
+                    <w:rPr>
+                      <w:b/>
+                      <w:bCs/>
+                      <w:sz w:val="24"/>
+                      <w:szCs w:val="24"/>
+                    </w:rPr>
+                  </w:pPr>
+                  <w:r>
+                    <w:rPr>
+                      <w:rFonts w:hint="eastAsia"/>
+                      <w:b/>
+                      <w:bCs/>
+                      <w:sz w:val="24"/>
+                      <w:szCs w:val="24"/>
+                    </w:rPr>
+                    <w:t>⑦</w:t>
+                  </w:r>
+                </w:p>
+                <w:p>
+                  <w:pPr>
+                    <w:rPr>
+                      <w:b/>
+                      <w:bCs/>
+                      <w:sz w:val="24"/>
+                      <w:szCs w:val="24"/>
+                    </w:rPr>
+                  </w:pPr>
+                  <w:r>
+                    <w:rPr>
+                      <w:rFonts w:hint="eastAsia"/>
+                      <w:b/>
+                      <w:bCs/>
+                      <w:sz w:val="24"/>
+                      <w:szCs w:val="24"/>
+                    </w:rPr>
+                    <w:t>⑧</w:t>
+                  </w:r>
+                </w:p>
+                <w:p>
+                  <w:pPr>
+                    <w:rPr>
+                      <w:b/>
+                      <w:bCs/>
+                      <w:sz w:val="24"/>
+                      <w:szCs w:val="24"/>
+                    </w:rPr>
+                  </w:pPr>
+                  <w:r>
+                    <w:rPr>
+                      <w:rFonts w:hint="eastAsia"/>
+                      <w:b/>
+                      <w:bCs/>
+                      <w:sz w:val="24"/>
+                      <w:szCs w:val="24"/>
+                    </w:rPr>
+                    <w:t>⑨</w:t>
+                  </w:r>
+                </w:p>
+              </w:tc>
+              <w:tc>
+                <w:tcPr>
+                  <w:tcW w:w="476" w:type="dxa"/>
+                </w:tcPr>
+                <w:p>
+                  <w:pPr>
+                    <w:rPr>
+                      <w:b/>
+                      <w:bCs/>
+                      <w:sz w:val="24"/>
+                      <w:szCs w:val="24"/>
+                    </w:rPr>
+                  </w:pPr>
+                  <w:r>
+                    <w:rPr>
+                      <w:rFonts w:hint="eastAsia"/>
+                      <w:b/>
+                      <w:bCs/>
+                      <w:sz w:val="24"/>
+                      <w:szCs w:val="24"/>
+                    </w:rPr>
+                    <w:t>⓪</w:t>
+                  </w:r>
+                </w:p>
+                <w:p>
+                  <w:pPr>
+                    <w:rPr>
+                      <w:b/>
+                      <w:bCs/>
+                      <w:sz w:val="24"/>
+                      <w:szCs w:val="24"/>
+                    </w:rPr>
+                  </w:pPr>
+                  <w:r>
+                    <w:rPr>
+                      <w:rFonts w:hint="eastAsia"/>
+                      <w:b/>
+                      <w:bCs/>
+                      <w:sz w:val="24"/>
+                      <w:szCs w:val="24"/>
+                    </w:rPr>
+                    <w:t>①</w:t>
+                  </w:r>
+                </w:p>
+                <w:p>
+                  <w:pPr>
+                    <w:rPr>
+                      <w:b/>
+                      <w:bCs/>
+                      <w:sz w:val="24"/>
+                      <w:szCs w:val="24"/>
+                    </w:rPr>
+                  </w:pPr>
+                  <w:r>
+                    <w:rPr>
+                      <w:rFonts w:hint="eastAsia"/>
+                      <w:b/>
+                      <w:bCs/>
+                      <w:sz w:val="24"/>
+                      <w:szCs w:val="24"/>
+                    </w:rPr>
+                    <w:t>②</w:t>
+                  </w:r>
+                </w:p>
+                <w:p>
+                  <w:pPr>
+                    <w:rPr>
+                      <w:b/>
+                      <w:bCs/>
+                      <w:sz w:val="24"/>
+                      <w:szCs w:val="24"/>
+                    </w:rPr>
+                  </w:pPr>
+                  <w:r>
+                    <w:rPr>
+                      <w:rFonts w:hint="eastAsia"/>
+                      <w:b/>
+                      <w:bCs/>
+                      <w:sz w:val="24"/>
+                      <w:szCs w:val="24"/>
+                    </w:rPr>
+                    <w:t>③</w:t>
+                  </w:r>
+                </w:p>
+                <w:p>
+                  <w:pPr>
+                    <w:rPr>
+                      <w:b/>
+                      <w:bCs/>
+                      <w:sz w:val="24"/>
+                      <w:szCs w:val="24"/>
+                    </w:rPr>
+                  </w:pPr>
+                  <w:r>
+                    <w:rPr>
+                      <w:rFonts w:hint="eastAsia"/>
+                      <w:b/>
+                      <w:bCs/>
+                      <w:sz w:val="24"/>
+                      <w:szCs w:val="24"/>
+                    </w:rPr>
+                    <w:t>④</w:t>
+                  </w:r>
+                </w:p>
+                <w:p>
+                  <w:pPr>
+                    <w:rPr>
+                      <w:b/>
+                      <w:bCs/>
+                      <w:sz w:val="24"/>
+                      <w:szCs w:val="24"/>
+                    </w:rPr>
+                  </w:pPr>
+                  <w:r>
+                    <w:rPr>
+                      <w:rFonts w:hint="eastAsia"/>
+                      <w:b/>
+                      <w:bCs/>
+                      <w:sz w:val="24"/>
+                      <w:szCs w:val="24"/>
+                    </w:rPr>
+                    <w:t>⑤</w:t>
+                  </w:r>
+                </w:p>
+                <w:p>
+                  <w:pPr>
+                    <w:rPr>
+                      <w:b/>
+                      <w:bCs/>
+                      <w:sz w:val="24"/>
+                      <w:szCs w:val="24"/>
+                    </w:rPr>
+                  </w:pPr>
+                  <w:r>
+                    <w:rPr>
+                      <w:rFonts w:hint="eastAsia"/>
+                      <w:b/>
+                      <w:bCs/>
+                      <w:sz w:val="24"/>
+                      <w:szCs w:val="24"/>
+                    </w:rPr>
+                    <w:t>⑥</w:t>
+                  </w:r>
+                </w:p>
+                <w:p>
+                  <w:pPr>
+                    <w:rPr>
+                      <w:b/>
+                      <w:bCs/>
+                      <w:sz w:val="24"/>
+                      <w:szCs w:val="24"/>
+                    </w:rPr>
+                  </w:pPr>
+                  <w:r>
+                    <w:rPr>
+                      <w:rFonts w:hint="eastAsia"/>
+                      <w:b/>
+                      <w:bCs/>
+                      <w:sz w:val="24"/>
+                      <w:szCs w:val="24"/>
+                    </w:rPr>
+                    <w:t>⑦</w:t>
+                  </w:r>
+                </w:p>
+                <w:p>
+                  <w:pPr>
+                    <w:rPr>
+                      <w:b/>
+                      <w:bCs/>
+                      <w:sz w:val="24"/>
+                      <w:szCs w:val="24"/>
+                    </w:rPr>
+                  </w:pPr>
+                  <w:r>
+                    <w:rPr>
+                      <w:rFonts w:hint="eastAsia"/>
+                      <w:b/>
+                      <w:bCs/>
+                      <w:sz w:val="24"/>
+                      <w:szCs w:val="24"/>
+                    </w:rPr>
+                    <w:t>⑧</w:t>
+                  </w:r>
+                </w:p>
+                <w:p>
+                  <w:pPr>
+                    <w:rPr>
+                      <w:b/>
+                      <w:bCs/>
+                      <w:sz w:val="24"/>
+                      <w:szCs w:val="24"/>
+                    </w:rPr>
+                  </w:pPr>
+                  <w:r>
+                    <w:rPr>
+                      <w:rFonts w:hint="eastAsia"/>
+                      <w:b/>
+                      <w:bCs/>
+                      <w:sz w:val="24"/>
+                      <w:szCs w:val="24"/>
+                    </w:rPr>
+                    <w:t>⑨</w:t>
+                  </w:r>
+                </w:p>
+              </w:tc>
+              <w:tc>
+                <w:tcPr>
+                  <w:tcW w:w="476" w:type="dxa"/>
+                </w:tcPr>
+                <w:p>
+                  <w:pPr>
+                    <w:rPr>
+                      <w:b/>
+                      <w:bCs/>
+                      <w:sz w:val="24"/>
+                      <w:szCs w:val="24"/>
+                    </w:rPr>
+                  </w:pPr>
+                  <w:r>
+                    <w:rPr>
+                      <w:rFonts w:hint="eastAsia"/>
+                      <w:b/>
+                      <w:bCs/>
+                      <w:sz w:val="24"/>
+                      <w:szCs w:val="24"/>
+                    </w:rPr>
+                    <w:t>⓪</w:t>
+                  </w:r>
+                </w:p>
+                <w:p>
+                  <w:pPr>
+                    <w:rPr>
+                      <w:b/>
+                      <w:bCs/>
+                      <w:sz w:val="24"/>
+                      <w:szCs w:val="24"/>
+                    </w:rPr>
+                  </w:pPr>
+                  <w:r>
+                    <w:rPr>
+                      <w:rFonts w:hint="eastAsia"/>
+                      <w:b/>
+                      <w:bCs/>
+                      <w:sz w:val="24"/>
+                      <w:szCs w:val="24"/>
+                    </w:rPr>
+                    <w:t>①</w:t>
+                  </w:r>
+                </w:p>
+                <w:p>
+                  <w:pPr>
+                    <w:rPr>
+                      <w:b/>
+                      <w:bCs/>
+                      <w:sz w:val="24"/>
+                      <w:szCs w:val="24"/>
+                    </w:rPr>
+                  </w:pPr>
+                  <w:r>
+                    <w:rPr>
+                      <w:rFonts w:hint="eastAsia"/>
+                      <w:b/>
+                      <w:bCs/>
+                      <w:sz w:val="24"/>
+                      <w:szCs w:val="24"/>
+                    </w:rPr>
+                    <w:t>②</w:t>
+                  </w:r>
+                </w:p>
+                <w:p>
+                  <w:pPr>
+                    <w:rPr>
+                      <w:b/>
+                      <w:bCs/>
+                      <w:sz w:val="24"/>
+                      <w:szCs w:val="24"/>
+                    </w:rPr>
+                  </w:pPr>
+                  <w:r>
+                    <w:rPr>
+                      <w:rFonts w:hint="eastAsia"/>
+                      <w:b/>
+                      <w:bCs/>
+                      <w:sz w:val="24"/>
+                      <w:szCs w:val="24"/>
+                    </w:rPr>
+                    <w:t>③</w:t>
+                  </w:r>
+                </w:p>
+                <w:p>
+                  <w:pPr>
+                    <w:rPr>
+                      <w:b/>
+                      <w:bCs/>
+                      <w:sz w:val="24"/>
+                      <w:szCs w:val="24"/>
+                    </w:rPr>
+                  </w:pPr>
+                  <w:r>
+                    <w:rPr>
+                      <w:rFonts w:hint="eastAsia"/>
+                      <w:b/>
+                      <w:bCs/>
+                      <w:sz w:val="24"/>
+                      <w:szCs w:val="24"/>
+                    </w:rPr>
+                    <w:t>④</w:t>
+                  </w:r>
+                </w:p>
+                <w:p>
+                  <w:pPr>
+                    <w:rPr>
+                      <w:b/>
+                      <w:bCs/>
+                      <w:sz w:val="24"/>
+                      <w:szCs w:val="24"/>
+                    </w:rPr>
+                  </w:pPr>
+                  <w:r>
+                    <w:rPr>
+                      <w:rFonts w:hint="eastAsia"/>
+                      <w:b/>
+                      <w:bCs/>
+                      <w:sz w:val="24"/>
+                      <w:szCs w:val="24"/>
+                    </w:rPr>
+                    <w:t>⑤</w:t>
+                  </w:r>
+                </w:p>
+                <w:p>
+                  <w:pPr>
+                    <w:rPr>
+                      <w:b/>
+                      <w:bCs/>
+                      <w:sz w:val="24"/>
+                      <w:szCs w:val="24"/>
+                    </w:rPr>
+                  </w:pPr>
+                  <w:r>
+                    <w:rPr>
+                      <w:rFonts w:hint="eastAsia"/>
+                      <w:b/>
+                      <w:bCs/>
+                      <w:sz w:val="24"/>
+                      <w:szCs w:val="24"/>
+                    </w:rPr>
+                    <w:t>⑥</w:t>
+                  </w:r>
+                </w:p>
+                <w:p>
+                  <w:pPr>
+                    <w:rPr>
+                      <w:b/>
+                      <w:bCs/>
+                      <w:sz w:val="24"/>
+                      <w:szCs w:val="24"/>
+                    </w:rPr>
+                  </w:pPr>
+                  <w:r>
+                    <w:rPr>
+                      <w:rFonts w:hint="eastAsia"/>
+                      <w:b/>
+                      <w:bCs/>
+                      <w:sz w:val="24"/>
+                      <w:szCs w:val="24"/>
+                    </w:rPr>
+                    <w:t>⑦</w:t>
+                  </w:r>
+                </w:p>
+                <w:p>
+                  <w:pPr>
+                    <w:rPr>
+                      <w:b/>
+                      <w:bCs/>
+                      <w:sz w:val="24"/>
+                      <w:szCs w:val="24"/>
+                    </w:rPr>
+                  </w:pPr>
+                  <w:r>
+                    <w:rPr>
+                      <w:rFonts w:hint="eastAsia"/>
+                      <w:b/>
+                      <w:bCs/>
+                      <w:sz w:val="24"/>
+                      <w:szCs w:val="24"/>
+                    </w:rPr>
+                    <w:t>⑧</w:t>
+                  </w:r>
+                </w:p>
+                <w:p>
+                  <w:pPr>
+                    <w:rPr>
+                      <w:b/>
+                      <w:bCs/>
+                      <w:sz w:val="24"/>
+                      <w:szCs w:val="24"/>
+                    </w:rPr>
+                  </w:pPr>
+                  <w:r>
+                    <w:rPr>
+                      <w:rFonts w:hint="eastAsia"/>
+                      <w:b/>
+                      <w:bCs/>
+                      <w:sz w:val="24"/>
+                      <w:szCs w:val="24"/>
+                    </w:rPr>
+                    <w:t>⑨</w:t>
+                  </w:r>
+                </w:p>
+              </w:tc>
+              <w:tc>
+                <w:tcPr>
+                  <w:tcW w:w="476" w:type="dxa"/>
+                </w:tcPr>
+                <w:p>
+                  <w:pPr>
+                    <w:rPr>
+                      <w:b/>
+                      <w:bCs/>
+                      <w:sz w:val="24"/>
+                      <w:szCs w:val="24"/>
+                    </w:rPr>
+                  </w:pPr>
+                  <w:r>
+                    <w:rPr>
+                      <w:rFonts w:hint="eastAsia"/>
+                      <w:b/>
+                      <w:bCs/>
+                      <w:sz w:val="24"/>
+                      <w:szCs w:val="24"/>
+                    </w:rPr>
+                    <w:t>⓪</w:t>
+                  </w:r>
+                </w:p>
+                <w:p>
+                  <w:pPr>
+                    <w:rPr>
+                      <w:b/>
+                      <w:bCs/>
+                      <w:sz w:val="24"/>
+                      <w:szCs w:val="24"/>
+                    </w:rPr>
+                  </w:pPr>
+                  <w:r>
+                    <w:rPr>
+                      <w:rFonts w:hint="eastAsia"/>
+                      <w:b/>
+                      <w:bCs/>
+                      <w:sz w:val="24"/>
+                      <w:szCs w:val="24"/>
+                    </w:rPr>
+                    <w:t>①</w:t>
+                  </w:r>
+                </w:p>
+                <w:p>
+                  <w:pPr>
+                    <w:rPr>
+                      <w:b/>
+                      <w:bCs/>
+                      <w:sz w:val="24"/>
+                      <w:szCs w:val="24"/>
+                    </w:rPr>
+                  </w:pPr>
+                  <w:r>
+                    <w:rPr>
+                      <w:rFonts w:hint="eastAsia"/>
+                      <w:b/>
+                      <w:bCs/>
+                      <w:sz w:val="24"/>
+                      <w:szCs w:val="24"/>
+                    </w:rPr>
+                    <w:t>②</w:t>
+                  </w:r>
+                </w:p>
+                <w:p>
+                  <w:pPr>
+                    <w:rPr>
+                      <w:b/>
+                      <w:bCs/>
+                      <w:sz w:val="24"/>
+                      <w:szCs w:val="24"/>
+                    </w:rPr>
+                  </w:pPr>
+                  <w:r>
+                    <w:rPr>
+                      <w:rFonts w:hint="eastAsia"/>
+                      <w:b/>
+                      <w:bCs/>
+                      <w:sz w:val="24"/>
+                      <w:szCs w:val="24"/>
+                    </w:rPr>
+                    <w:t>③</w:t>
+                  </w:r>
+                </w:p>
+                <w:p>
+                  <w:pPr>
+                    <w:rPr>
+                      <w:b/>
+                      <w:bCs/>
+                      <w:sz w:val="24"/>
+                      <w:szCs w:val="24"/>
+                    </w:rPr>
+                  </w:pPr>
+                  <w:r>
+                    <w:rPr>
+                      <w:rFonts w:hint="eastAsia"/>
+                      <w:b/>
+                      <w:bCs/>
+                      <w:sz w:val="24"/>
+                      <w:szCs w:val="24"/>
+                    </w:rPr>
+                    <w:t>④</w:t>
+                  </w:r>
+                </w:p>
+                <w:p>
+                  <w:pPr>
+                    <w:rPr>
+                      <w:b/>
+                      <w:bCs/>
+                      <w:sz w:val="24"/>
+                      <w:szCs w:val="24"/>
+                    </w:rPr>
+                  </w:pPr>
+                  <w:r>
+                    <w:rPr>
+                      <w:rFonts w:hint="eastAsia"/>
+                      <w:b/>
+                      <w:bCs/>
+                      <w:sz w:val="24"/>
+                      <w:szCs w:val="24"/>
+                    </w:rPr>
+                    <w:t>⑤</w:t>
+                  </w:r>
+                </w:p>
+                <w:p>
+                  <w:pPr>
+                    <w:rPr>
+                      <w:b/>
+                      <w:bCs/>
+                      <w:sz w:val="24"/>
+                      <w:szCs w:val="24"/>
+                    </w:rPr>
+                  </w:pPr>
+                  <w:r>
+                    <w:rPr>
+                      <w:rFonts w:hint="eastAsia"/>
+                      <w:b/>
+                      <w:bCs/>
+                      <w:sz w:val="24"/>
+                      <w:szCs w:val="24"/>
+                    </w:rPr>
+                    <w:t>⑥</w:t>
+                  </w:r>
+                </w:p>
+                <w:p>
+                  <w:pPr>
+                    <w:rPr>
+                      <w:b/>
+                      <w:bCs/>
+                      <w:sz w:val="24"/>
+                      <w:szCs w:val="24"/>
+                    </w:rPr>
+                  </w:pPr>
+                  <w:r>
+                    <w:rPr>
+                      <w:rFonts w:hint="eastAsia"/>
+                      <w:b/>
+                      <w:bCs/>
+                      <w:sz w:val="24"/>
+                      <w:szCs w:val="24"/>
+                    </w:rPr>
+                    <w:t>⑦</w:t>
+                  </w:r>
+                </w:p>
+                <w:p>
+                  <w:pPr>
+                    <w:rPr>
+                      <w:b/>
+                      <w:bCs/>
+                      <w:sz w:val="24"/>
+                      <w:szCs w:val="24"/>
+                    </w:rPr>
+                  </w:pPr>
+                  <w:r>
+                    <w:rPr>
+                      <w:rFonts w:hint="eastAsia"/>
+                      <w:b/>
+                      <w:bCs/>
+                      <w:sz w:val="24"/>
+                      <w:szCs w:val="24"/>
+                    </w:rPr>
+                    <w:t>⑧</w:t>
+                  </w:r>
+                </w:p>
+                <w:p>
+                  <w:pPr>
+                    <w:rPr>
+                      <w:b/>
+                      <w:bCs/>
+                      <w:sz w:val="24"/>
+                      <w:szCs w:val="24"/>
+                    </w:rPr>
+                  </w:pPr>
+                  <w:r>
+                    <w:rPr>
+                      <w:rFonts w:hint="eastAsia"/>
+                      <w:b/>
+                      <w:bCs/>
+                      <w:sz w:val="24"/>
+                      <w:szCs w:val="24"/>
+                    </w:rPr>
+                    <w:t>⑨</w:t>
+                  </w:r>
+                </w:p>
+              </w:tc>
+              <w:tc>
+                <w:tcPr>
+                  <w:tcW w:w="477" w:type="dxa"/>
+                </w:tcPr>
+                <w:p>
+                  <w:pPr>
+                    <w:rPr>
+                      <w:b/>
+                      <w:bCs/>
+                      <w:sz w:val="24"/>
+                      <w:szCs w:val="24"/>
+                    </w:rPr>
+                  </w:pPr>
+                  <w:r>
+                    <w:rPr>
+                      <w:rFonts w:hint="eastAsia"/>
+                      <w:b/>
+                      <w:bCs/>
+                      <w:sz w:val="24"/>
+                      <w:szCs w:val="24"/>
+                    </w:rPr>
+                    <w:t>⓪</w:t>
+                  </w:r>
+                </w:p>
+                <w:p>
+                  <w:pPr>
+                    <w:rPr>
+                      <w:b/>
+                      <w:bCs/>
+                      <w:sz w:val="24"/>
+                      <w:szCs w:val="24"/>
+                    </w:rPr>
+                  </w:pPr>
+                  <w:r>
+                    <w:rPr>
+                      <w:rFonts w:hint="eastAsia"/>
+                      <w:b/>
+                      <w:bCs/>
+                      <w:sz w:val="24"/>
+                      <w:szCs w:val="24"/>
+                    </w:rPr>
+                    <w:t>①</w:t>
+                  </w:r>
+                </w:p>
+                <w:p>
+                  <w:pPr>
+                    <w:rPr>
+                      <w:b/>
+                      <w:bCs/>
+                      <w:sz w:val="24"/>
+                      <w:szCs w:val="24"/>
+                    </w:rPr>
+                  </w:pPr>
+                  <w:r>
+                    <w:rPr>
+                      <w:rFonts w:hint="eastAsia"/>
+                      <w:b/>
+                      <w:bCs/>
+                      <w:sz w:val="24"/>
+                      <w:szCs w:val="24"/>
+                    </w:rPr>
+                    <w:t>②</w:t>
+                  </w:r>
+                </w:p>
+                <w:p>
+                  <w:pPr>
+                    <w:rPr>
+                      <w:b/>
+                      <w:bCs/>
+                      <w:sz w:val="24"/>
+                      <w:szCs w:val="24"/>
+                    </w:rPr>
+                  </w:pPr>
+                  <w:r>
+                    <w:rPr>
+                      <w:rFonts w:hint="eastAsia"/>
+                      <w:b/>
+                      <w:bCs/>
+                      <w:sz w:val="24"/>
+                      <w:szCs w:val="24"/>
+                    </w:rPr>
+                    <w:t>③</w:t>
+                  </w:r>
+                </w:p>
+                <w:p>
+                  <w:pPr>
+                    <w:rPr>
+                      <w:b/>
+                      <w:bCs/>
+                      <w:sz w:val="24"/>
+                      <w:szCs w:val="24"/>
+                    </w:rPr>
+                  </w:pPr>
+                  <w:r>
+                    <w:rPr>
+                      <w:rFonts w:hint="eastAsia"/>
+                      <w:b/>
+                      <w:bCs/>
+                      <w:sz w:val="24"/>
+                      <w:szCs w:val="24"/>
+                    </w:rPr>
+                    <w:t>④</w:t>
+                  </w:r>
+                </w:p>
+                <w:p>
+                  <w:pPr>
+                    <w:rPr>
+                      <w:b/>
+                      <w:bCs/>
+                      <w:sz w:val="24"/>
+                      <w:szCs w:val="24"/>
+                    </w:rPr>
+                  </w:pPr>
+                  <w:r>
+                    <w:rPr>
+                      <w:rFonts w:hint="eastAsia"/>
+                      <w:b/>
+                      <w:bCs/>
+                      <w:sz w:val="24"/>
+                      <w:szCs w:val="24"/>
+                    </w:rPr>
+                    <w:t>⑤</w:t>
+                  </w:r>
+                </w:p>
+                <w:p>
+                  <w:pPr>
+                    <w:rPr>
+                      <w:b/>
+                      <w:bCs/>
+                      <w:sz w:val="24"/>
+                      <w:szCs w:val="24"/>
+                    </w:rPr>
+                  </w:pPr>
+                  <w:r>
+                    <w:rPr>
+                      <w:rFonts w:hint="eastAsia"/>
+                      <w:b/>
+                      <w:bCs/>
+                      <w:sz w:val="24"/>
+                      <w:szCs w:val="24"/>
+                    </w:rPr>
+                    <w:t>⑥</w:t>
+                  </w:r>
+                </w:p>
+                <w:p>
+                  <w:pPr>
+                    <w:rPr>
+                      <w:b/>
+                      <w:bCs/>
+                      <w:sz w:val="24"/>
+                      <w:szCs w:val="24"/>
+                    </w:rPr>
+                  </w:pPr>
+                  <w:r>
+                    <w:rPr>
+                      <w:rFonts w:hint="eastAsia"/>
+                      <w:b/>
+                      <w:bCs/>
+                      <w:sz w:val="24"/>
+                      <w:szCs w:val="24"/>
+                    </w:rPr>
+                    <w:t>⑦</w:t>
+                  </w:r>
+                </w:p>
+                <w:p>
+                  <w:pPr>
+                    <w:rPr>
+                      <w:b/>
+                      <w:bCs/>
+                      <w:sz w:val="24"/>
+                      <w:szCs w:val="24"/>
+                    </w:rPr>
+                  </w:pPr>
+                  <w:r>
+                    <w:rPr>
+                      <w:rFonts w:hint="eastAsia"/>
+                      <w:b/>
+                      <w:bCs/>
+                      <w:sz w:val="24"/>
+                      <w:szCs w:val="24"/>
+                    </w:rPr>
+                    <w:t>⑧</w:t>
+                  </w:r>
+                </w:p>
+                <w:p>
+                  <w:pPr>
+                    <w:rPr>
+                      <w:b/>
+                      <w:bCs/>
+                      <w:sz w:val="24"/>
+                      <w:szCs w:val="24"/>
+                    </w:rPr>
+                  </w:pPr>
+                  <w:r>
+                    <w:rPr>
+                      <w:rFonts w:hint="eastAsia"/>
+                      <w:b/>
+                      <w:bCs/>
+                      <w:sz w:val="24"/>
+                      <w:szCs w:val="24"/>
+                    </w:rPr>
+                    <w:t>⑨</w:t>
+                  </w:r>
+                </w:p>
+              </w:tc>
+              <w:tc>
+                <w:tcPr>
+                  <w:tcW w:w="477" w:type="dxa"/>
+                </w:tcPr>
+                <w:p>
+                  <w:pPr>
+                    <w:rPr>
+                      <w:b/>
+                      <w:bCs/>
+                      <w:sz w:val="24"/>
+                      <w:szCs w:val="24"/>
+                    </w:rPr>
+                  </w:pPr>
+                  <w:r>
+                    <w:rPr>
+                      <w:rFonts w:hint="eastAsia"/>
+                      <w:b/>
+                      <w:bCs/>
+                      <w:sz w:val="24"/>
+                      <w:szCs w:val="24"/>
+                    </w:rPr>
+                    <w:t>⓪</w:t>
+                  </w:r>
+                </w:p>
+                <w:p>
+                  <w:pPr>
+                    <w:rPr>
+                      <w:b/>
+                      <w:bCs/>
+                      <w:sz w:val="24"/>
+                      <w:szCs w:val="24"/>
+                    </w:rPr>
+                  </w:pPr>
+                  <w:r>
+                    <w:rPr>
+                      <w:rFonts w:hint="eastAsia"/>
+                      <w:b/>
+                      <w:bCs/>
+                      <w:sz w:val="24"/>
+                      <w:szCs w:val="24"/>
+                    </w:rPr>
+                    <w:t>①</w:t>
+                  </w:r>
+                </w:p>
+                <w:p>
+                  <w:pPr>
+                    <w:rPr>
+                      <w:b/>
+                      <w:bCs/>
+                      <w:sz w:val="24"/>
+                      <w:szCs w:val="24"/>
+                    </w:rPr>
+                  </w:pPr>
+                  <w:r>
+                    <w:rPr>
+                      <w:rFonts w:hint="eastAsia"/>
+                      <w:b/>
+                      <w:bCs/>
+                      <w:sz w:val="24"/>
+                      <w:szCs w:val="24"/>
+                    </w:rPr>
+                    <w:t>②</w:t>
+                  </w:r>
+                </w:p>
+                <w:p>
+                  <w:pPr>
+                    <w:rPr>
+                      <w:b/>
+                      <w:bCs/>
+                      <w:sz w:val="24"/>
+                      <w:szCs w:val="24"/>
+                    </w:rPr>
+                  </w:pPr>
+                  <w:r>
+                    <w:rPr>
+                      <w:rFonts w:hint="eastAsia"/>
+                      <w:b/>
+                      <w:bCs/>
+                      <w:sz w:val="24"/>
+                      <w:szCs w:val="24"/>
+                    </w:rPr>
+                    <w:t>③</w:t>
+                  </w:r>
+                </w:p>
+                <w:p>
+                  <w:pPr>
+                    <w:rPr>
+                      <w:b/>
+                      <w:bCs/>
+                      <w:sz w:val="24"/>
+                      <w:szCs w:val="24"/>
+                    </w:rPr>
+                  </w:pPr>
+                  <w:r>
+                    <w:rPr>
+                      <w:rFonts w:hint="eastAsia"/>
+                      <w:b/>
+                      <w:bCs/>
+                      <w:sz w:val="24"/>
+                      <w:szCs w:val="24"/>
+                    </w:rPr>
+                    <w:t>④</w:t>
+                  </w:r>
+                </w:p>
+                <w:p>
+                  <w:pPr>
+                    <w:rPr>
+                      <w:b/>
+                      <w:bCs/>
+                      <w:sz w:val="24"/>
+                      <w:szCs w:val="24"/>
+                    </w:rPr>
+                  </w:pPr>
+                  <w:r>
+                    <w:rPr>
+                      <w:rFonts w:hint="eastAsia"/>
+                      <w:b/>
+                      <w:bCs/>
+                      <w:sz w:val="24"/>
+                      <w:szCs w:val="24"/>
+                    </w:rPr>
+                    <w:t>⑤</w:t>
+                  </w:r>
+                </w:p>
+                <w:p>
+                  <w:pPr>
+                    <w:rPr>
+                      <w:b/>
+                      <w:bCs/>
+                      <w:sz w:val="24"/>
+                      <w:szCs w:val="24"/>
+                    </w:rPr>
+                  </w:pPr>
+                  <w:r>
+                    <w:rPr>
+                      <w:rFonts w:hint="eastAsia"/>
+                      <w:b/>
+                      <w:bCs/>
+                      <w:sz w:val="24"/>
+                      <w:szCs w:val="24"/>
+                    </w:rPr>
+                    <w:t>⑥</w:t>
+                  </w:r>
+                </w:p>
+                <w:p>
+                  <w:pPr>
+                    <w:rPr>
+                      <w:b/>
+                      <w:bCs/>
+                      <w:sz w:val="24"/>
+                      <w:szCs w:val="24"/>
+                    </w:rPr>
+                  </w:pPr>
+                  <w:r>
+                    <w:rPr>
+                      <w:rFonts w:hint="eastAsia"/>
+                      <w:b/>
+                      <w:bCs/>
+                      <w:sz w:val="24"/>
+                      <w:szCs w:val="24"/>
+                    </w:rPr>
+                    <w:t>⑦</w:t>
+                  </w:r>
+                </w:p>
+                <w:p>
+                  <w:pPr>
+                    <w:rPr>
+                      <w:b/>
+                      <w:bCs/>
+                      <w:sz w:val="24"/>
+                      <w:szCs w:val="24"/>
+                    </w:rPr>
+                  </w:pPr>
+                  <w:r>
+                    <w:rPr>
+                      <w:rFonts w:hint="eastAsia"/>
+                      <w:b/>
+                      <w:bCs/>
+                      <w:sz w:val="24"/>
+                      <w:szCs w:val="24"/>
+                    </w:rPr>
+                    <w:t>⑧</w:t>
+                  </w:r>
+                </w:p>
+                <w:p>
+                  <w:pPr>
+                    <w:rPr>
+                      <w:b/>
+                      <w:bCs/>
+                      <w:sz w:val="24"/>
+                      <w:szCs w:val="24"/>
+                    </w:rPr>
+                  </w:pPr>
+                  <w:r>
+                    <w:rPr>
+                      <w:rFonts w:hint="eastAsia"/>
+                      <w:b/>
+                      <w:bCs/>
+                      <w:sz w:val="24"/>
+                      <w:szCs w:val="24"/>
+                    </w:rPr>
+                    <w:t>⑨</w:t>
+                  </w:r>
+                </w:p>
+              </w:tc>
+            </w:tr>
+          </w:tbl>
           <w:p>
             <w:pPr>
-              <w:ind w:left="283"/>
+              <w:rPr>
+                <w:b/>
+                <w:bCs/>
+              </w:rPr>
             </w:pPr>
-            <w:r>
-              <w:rPr>
-                <w:sz w:val="20"/>
-              </w:rPr>
-              <w:t>• Mỗi câu chỉ viết trong phần giữa marker BẮT ĐẦU và KẾT THÚC tương ứng.</w:t>
-            </w:r>
-          </w:p>
-          <w:p>
-            <w:pPr>
-              <w:ind w:left="283"/>
-            </w:pPr>
-            <w:r>
-              <w:rPr>
-                <w:sz w:val="20"/>
-              </w:rPr>
-              <w:t>• Nếu cần làm nháp, dùng mặt sau hoặc giấy nháp riêng, không viết chen vào lề.</w:t>
-            </w:r>
-          </w:p>
-          <w:p>
-            <w:pPr>
-              <w:ind w:left="283"/>
-            </w:pPr>
-            <w:r>
-              <w:rPr>
-                <w:sz w:val="20"/>
-              </w:rPr>
-              <w:t>• Khi scan, hệ thống sẽ tách nội dung từng câu để Gemini chấm.</w:t>
-            </w:r>
           </w:p>
         </w:tc>
       </w:tr>
     </w:tbl>
-    <w:p/>
+    <w:p>
+      <w:pPr>
+        <w:rPr>
+          <w:b/>
+          <w:sz w:val="24"/>
+        </w:rPr>
+      </w:pPr>
+    </w:p>
     <w:p>
       <w:r>
         <w:rPr>
           <w:b/>
           <w:sz w:val="24"/>
         </w:rPr>
-        <w:t>A. ĐỀ THI TỰ LUẬN</w:t>
+        <w:t>A</w:t>
+      </w:r>
+      <w:r>
+        <w:rPr>
+          <w:b/>
+          <w:sz w:val="24"/>
+        </w:rPr>
+        <w:t>. PHẦN TỰ LUẬN</w:t>
+      </w:r>
+      <w:r>
+        <w:rPr>
+          <w:b/>
+          <w:sz w:val="24"/>
+        </w:rPr>
+        <w:t xml:space="preserve"> </w:t>
+      </w:r>
+      <w:r>
+        <w:rPr>
+          <w:b/>
+          <w:sz w:val="24"/>
+        </w:rPr>
+        <w:t>({essay_fullscore})</w:t>
+      </w:r>
+    </w:p>
+    <w:p>
+      <w:pPr>
+        <w:rPr>
+          <w:i/>
+          <w:sz w:val="19"/>
+        </w:rPr>
+      </w:pPr>
+      <w:r>
+        <w:rPr>
+          <w:i/>
+          <w:sz w:val="19"/>
+        </w:rPr>
+        <w:t>AI sẽ chỉ trích xuất phần nằm giữa marker BẮT ĐẦU và KẾT THÚC của từng câu. Không viết tràn qua marker</w:t>
       </w:r>
     </w:p>
     <w:p>
       <w:r>
-        <w:t>{#first_essay_questions}</w:t>
+        <w:rPr>
+          <w:i/>
+          <w:sz w:val="19"/>
+        </w:rPr>
+        <w:t>.</w:t>
+      </w:r>
+    </w:p>
+    <w:p/>
+    <w:p/>
+    <w:p/>
+    <w:p/>
+    <w:p/>
+    <w:p/>
+    <w:p/>
+    <w:p/>
+    <w:p/>
+    <w:p/>
+    <w:p/>
+    <w:p/>
+    <w:p/>
+    <w:p/>
+    <w:p/>
+    <w:p/>
+    <w:p/>
+    <w:p/>
+    <w:p/>
+    <w:p>
+      <w:r>
+        <w:lastRenderedPageBreak/>
+        <w:t>{#essays}</w:t>
       </w:r>
     </w:p>
     <w:p>
+      <w:r>
+        <w:br w:type="page"/>
+      </w:r>
       <w:r>
         <w:rPr>
           <w:b/>
@@ -417,7 +2203,13 @@
         <w:t>Câu {index}</w:t>
       </w:r>
       <w:r>
-        <w:t xml:space="preserve"> ({score} điểm): {question}</w:t>
+        <w:t>: {title}</w:t>
+      </w:r>
+      <w:r>
+        <w:t xml:space="preserve"> </w:t>
+      </w:r>
+      <w:r>
+        <w:t>({essay_score})</w:t>
       </w:r>
     </w:p>
     <w:p>
@@ -426,6 +2218,14 @@
       </w:pPr>
       <w:r>
         <w:t>Mã câu: ESSAY_{index}</w:t>
+      </w:r>
+    </w:p>
+    <w:p>
+      <w:pPr>
+        <w:ind w:left="283"/>
+      </w:pPr>
+      <w:r>
+        <w:t>Đề bài: {content}</w:t>
       </w:r>
     </w:p>
     <w:p>
@@ -467,6 +2267,9 @@
             </w:tcMar>
           </w:tcPr>
           <w:p>
+            <w:pPr>
+              <w:spacing w:after="0"/>
+            </w:pPr>
             <w:r>
               <w:t xml:space="preserve"> </w:t>
             </w:r>
@@ -494,6 +2297,9 @@
             </w:tcMar>
           </w:tcPr>
           <w:p>
+            <w:pPr>
+              <w:spacing w:after="0"/>
+            </w:pPr>
             <w:r>
               <w:t xml:space="preserve"> </w:t>
             </w:r>
@@ -521,6 +2327,9 @@
             </w:tcMar>
           </w:tcPr>
           <w:p>
+            <w:pPr>
+              <w:spacing w:after="0"/>
+            </w:pPr>
             <w:r>
               <w:t xml:space="preserve"> </w:t>
             </w:r>
@@ -548,6 +2357,9 @@
             </w:tcMar>
           </w:tcPr>
           <w:p>
+            <w:pPr>
+              <w:spacing w:after="0"/>
+            </w:pPr>
             <w:r>
               <w:t xml:space="preserve"> </w:t>
             </w:r>
@@ -575,6 +2387,9 @@
             </w:tcMar>
           </w:tcPr>
           <w:p>
+            <w:pPr>
+              <w:spacing w:after="0"/>
+            </w:pPr>
             <w:r>
               <w:t xml:space="preserve"> </w:t>
             </w:r>
@@ -602,6 +2417,9 @@
             </w:tcMar>
           </w:tcPr>
           <w:p>
+            <w:pPr>
+              <w:spacing w:after="0"/>
+            </w:pPr>
             <w:r>
               <w:t xml:space="preserve"> </w:t>
             </w:r>
@@ -629,6 +2447,9 @@
             </w:tcMar>
           </w:tcPr>
           <w:p>
+            <w:pPr>
+              <w:spacing w:after="0"/>
+            </w:pPr>
             <w:r>
               <w:t xml:space="preserve"> </w:t>
             </w:r>
@@ -656,6 +2477,9 @@
             </w:tcMar>
           </w:tcPr>
           <w:p>
+            <w:pPr>
+              <w:spacing w:after="0"/>
+            </w:pPr>
             <w:r>
               <w:t xml:space="preserve"> </w:t>
             </w:r>
@@ -683,9 +2507,9 @@
             </w:tcMar>
           </w:tcPr>
           <w:p>
-            <w:r>
-              <w:t xml:space="preserve"> </w:t>
-            </w:r>
+            <w:pPr>
+              <w:spacing w:after="0"/>
+            </w:pPr>
           </w:p>
         </w:tc>
       </w:tr>
@@ -710,116 +2534,9 @@
             </w:tcMar>
           </w:tcPr>
           <w:p>
-            <w:r>
-              <w:t xml:space="preserve"> </w:t>
-            </w:r>
-          </w:p>
-        </w:tc>
-      </w:tr>
-      <w:tr>
-        <w:trPr>
-          <w:jc w:val="center"/>
-        </w:trPr>
-        <w:tc>
-          <w:tcPr>
-            <w:tcW w:w="10312" w:type="dxa"/>
-            <w:tcBorders>
-              <w:top w:val="single" w:sz="6" w:space="0" w:color="D8E0E7"/>
-              <w:left w:val="single" w:sz="6" w:space="0" w:color="D8E0E7"/>
-              <w:bottom w:val="single" w:sz="6" w:space="0" w:color="D8E0E7"/>
-              <w:right w:val="single" w:sz="6" w:space="0" w:color="D8E0E7"/>
-            </w:tcBorders>
-            <w:tcMar>
-              <w:top w:w="100" w:type="dxa"/>
-              <w:left w:w="100" w:type="dxa"/>
-              <w:bottom w:w="100" w:type="dxa"/>
-              <w:right w:w="100" w:type="dxa"/>
-            </w:tcMar>
-          </w:tcPr>
-          <w:p/>
-        </w:tc>
-      </w:tr>
-    </w:tbl>
-    <w:p>
-      <w:r>
-        <w:rPr>
-          <w:b/>
-        </w:rPr>
-        <w:t>KẾT THÚC TRẢ LỜI CÂU {index}</w:t>
-      </w:r>
-    </w:p>
-    <w:p>
-      <w:r>
-        <w:t>{/first_essay_questions}</w:t>
-      </w:r>
-    </w:p>
-    <w:p>
-      <w:r>
-        <w:t>{#remaining_essay_questions}</w:t>
-      </w:r>
-    </w:p>
-    <w:p>
-      <w:r>
-        <w:rPr>
-          <w:b/>
-        </w:rPr>
-        <w:br w:type="page"/>
-        <w:t>Câu {index}</w:t>
-      </w:r>
-      <w:r>
-        <w:t xml:space="preserve"> ({score} điểm): {question}</w:t>
-      </w:r>
-    </w:p>
-    <w:p>
-      <w:pPr>
-        <w:ind w:left="283"/>
-      </w:pPr>
-      <w:r>
-        <w:t>Mã câu: ESSAY_{index}</w:t>
-      </w:r>
-    </w:p>
-    <w:p>
-      <w:r>
-        <w:rPr>
-          <w:b/>
-        </w:rPr>
-        <w:t>BẮT ĐẦU TRẢ LỜI CÂU {index}</w:t>
-      </w:r>
-    </w:p>
-    <w:tbl>
-      <w:tblPr>
-        <w:tblW w:w="0" w:type="auto"/>
-        <w:jc w:val="center"/>
-        <w:tblLayout w:type="fixed"/>
-        <w:tblLook w:val="04A0" w:firstRow="1" w:lastRow="0" w:firstColumn="1" w:lastColumn="0" w:noHBand="0" w:noVBand="1"/>
-      </w:tblPr>
-      <w:tblGrid>
-        <w:gridCol w:w="10312"/>
-      </w:tblGrid>
-      <w:tr>
-        <w:trPr>
-          <w:jc w:val="center"/>
-        </w:trPr>
-        <w:tc>
-          <w:tcPr>
-            <w:tcW w:w="10312" w:type="dxa"/>
-            <w:tcBorders>
-              <w:top w:val="single" w:sz="6" w:space="0" w:color="D8E0E7"/>
-              <w:left w:val="single" w:sz="6" w:space="0" w:color="D8E0E7"/>
-              <w:bottom w:val="single" w:sz="6" w:space="0" w:color="D8E0E7"/>
-              <w:right w:val="single" w:sz="6" w:space="0" w:color="D8E0E7"/>
-            </w:tcBorders>
-            <w:tcMar>
-              <w:top w:w="100" w:type="dxa"/>
-              <w:left w:w="100" w:type="dxa"/>
-              <w:bottom w:w="100" w:type="dxa"/>
-              <w:right w:w="100" w:type="dxa"/>
-            </w:tcMar>
-          </w:tcPr>
-          <w:p>
-            <w:r>
-              <w:t xml:space="preserve"> </w:t>
-            </w:r>
+            <w:pPr>
+              <w:spacing w:after="0"/>
+            </w:pPr>
           </w:p>
         </w:tc>
       </w:tr>
@@ -844,9 +2561,9 @@
             </w:tcMar>
           </w:tcPr>
           <w:p>
-            <w:r>
-              <w:t xml:space="preserve"> </w:t>
-            </w:r>
+            <w:pPr>
+              <w:spacing w:after="0"/>
+            </w:pPr>
           </w:p>
         </w:tc>
       </w:tr>
@@ -871,9 +2588,9 @@
             </w:tcMar>
           </w:tcPr>
           <w:p>
-            <w:r>
-              <w:t xml:space="preserve"> </w:t>
-            </w:r>
+            <w:pPr>
+              <w:spacing w:after="0"/>
+            </w:pPr>
           </w:p>
         </w:tc>
       </w:tr>
@@ -898,9 +2615,9 @@
             </w:tcMar>
           </w:tcPr>
           <w:p>
-            <w:r>
-              <w:t xml:space="preserve"> </w:t>
-            </w:r>
+            <w:pPr>
+              <w:spacing w:after="0"/>
+            </w:pPr>
           </w:p>
         </w:tc>
       </w:tr>
@@ -925,9 +2642,9 @@
             </w:tcMar>
           </w:tcPr>
           <w:p>
-            <w:r>
-              <w:t xml:space="preserve"> </w:t>
-            </w:r>
+            <w:pPr>
+              <w:spacing w:after="0"/>
+            </w:pPr>
           </w:p>
         </w:tc>
       </w:tr>
@@ -952,9 +2669,9 @@
             </w:tcMar>
           </w:tcPr>
           <w:p>
-            <w:r>
-              <w:t xml:space="preserve"> </w:t>
-            </w:r>
+            <w:pPr>
+              <w:spacing w:after="0"/>
+            </w:pPr>
           </w:p>
         </w:tc>
       </w:tr>
@@ -979,9 +2696,9 @@
             </w:tcMar>
           </w:tcPr>
           <w:p>
-            <w:r>
-              <w:t xml:space="preserve"> </w:t>
-            </w:r>
+            <w:pPr>
+              <w:spacing w:after="0"/>
+            </w:pPr>
           </w:p>
         </w:tc>
       </w:tr>
@@ -1006,9 +2723,9 @@
             </w:tcMar>
           </w:tcPr>
           <w:p>
-            <w:r>
-              <w:t xml:space="preserve"> </w:t>
-            </w:r>
+            <w:pPr>
+              <w:spacing w:after="0"/>
+            </w:pPr>
           </w:p>
         </w:tc>
       </w:tr>
@@ -1033,9 +2750,9 @@
             </w:tcMar>
           </w:tcPr>
           <w:p>
-            <w:r>
-              <w:t xml:space="preserve"> </w:t>
-            </w:r>
+            <w:pPr>
+              <w:spacing w:after="0"/>
+            </w:pPr>
           </w:p>
         </w:tc>
       </w:tr>
@@ -1060,9 +2777,9 @@
             </w:tcMar>
           </w:tcPr>
           <w:p>
-            <w:r>
-              <w:t xml:space="preserve"> </w:t>
-            </w:r>
+            <w:pPr>
+              <w:spacing w:after="0"/>
+            </w:pPr>
           </w:p>
         </w:tc>
       </w:tr>
@@ -1086,7 +2803,11 @@
               <w:right w:w="100" w:type="dxa"/>
             </w:tcMar>
           </w:tcPr>
-          <w:p/>
+          <w:p>
+            <w:pPr>
+              <w:spacing w:after="0"/>
+            </w:pPr>
+          </w:p>
         </w:tc>
       </w:tr>
       <w:tr>
@@ -1109,7 +2830,11 @@
               <w:right w:w="100" w:type="dxa"/>
             </w:tcMar>
           </w:tcPr>
-          <w:p/>
+          <w:p>
+            <w:pPr>
+              <w:spacing w:after="0"/>
+            </w:pPr>
+          </w:p>
         </w:tc>
       </w:tr>
       <w:tr>
@@ -1132,7 +2857,11 @@
               <w:right w:w="100" w:type="dxa"/>
             </w:tcMar>
           </w:tcPr>
-          <w:p/>
+          <w:p>
+            <w:pPr>
+              <w:spacing w:after="0"/>
+            </w:pPr>
+          </w:p>
         </w:tc>
       </w:tr>
       <w:tr>
@@ -1155,171 +2884,21 @@
               <w:right w:w="100" w:type="dxa"/>
             </w:tcMar>
           </w:tcPr>
-          <w:p/>
-        </w:tc>
-      </w:tr>
-      <w:tr>
-        <w:trPr>
-          <w:jc w:val="center"/>
-        </w:trPr>
-        <w:tc>
-          <w:tcPr>
-            <w:tcW w:w="10312" w:type="dxa"/>
-            <w:tcBorders>
-              <w:top w:val="single" w:sz="6" w:space="0" w:color="D8E0E7"/>
-              <w:left w:val="single" w:sz="6" w:space="0" w:color="D8E0E7"/>
-              <w:bottom w:val="single" w:sz="6" w:space="0" w:color="D8E0E7"/>
-              <w:right w:val="single" w:sz="6" w:space="0" w:color="D8E0E7"/>
-            </w:tcBorders>
-            <w:tcMar>
-              <w:top w:w="100" w:type="dxa"/>
-              <w:left w:w="100" w:type="dxa"/>
-              <w:bottom w:w="100" w:type="dxa"/>
-              <w:right w:w="100" w:type="dxa"/>
-            </w:tcMar>
-          </w:tcPr>
-          <w:p/>
-        </w:tc>
-      </w:tr>
-      <w:tr>
-        <w:trPr>
-          <w:jc w:val="center"/>
-        </w:trPr>
-        <w:tc>
-          <w:tcPr>
-            <w:tcW w:w="10312" w:type="dxa"/>
-            <w:tcBorders>
-              <w:top w:val="single" w:sz="6" w:space="0" w:color="D8E0E7"/>
-              <w:left w:val="single" w:sz="6" w:space="0" w:color="D8E0E7"/>
-              <w:bottom w:val="single" w:sz="6" w:space="0" w:color="D8E0E7"/>
-              <w:right w:val="single" w:sz="6" w:space="0" w:color="D8E0E7"/>
-            </w:tcBorders>
-            <w:tcMar>
-              <w:top w:w="100" w:type="dxa"/>
-              <w:left w:w="100" w:type="dxa"/>
-              <w:bottom w:w="100" w:type="dxa"/>
-              <w:right w:w="100" w:type="dxa"/>
-            </w:tcMar>
-          </w:tcPr>
-          <w:p/>
-        </w:tc>
-      </w:tr>
-      <w:tr>
-        <w:trPr>
-          <w:jc w:val="center"/>
-        </w:trPr>
-        <w:tc>
-          <w:tcPr>
-            <w:tcW w:w="10312" w:type="dxa"/>
-            <w:tcBorders>
-              <w:top w:val="single" w:sz="6" w:space="0" w:color="D8E0E7"/>
-              <w:left w:val="single" w:sz="6" w:space="0" w:color="D8E0E7"/>
-              <w:bottom w:val="single" w:sz="6" w:space="0" w:color="D8E0E7"/>
-              <w:right w:val="single" w:sz="6" w:space="0" w:color="D8E0E7"/>
-            </w:tcBorders>
-            <w:tcMar>
-              <w:top w:w="100" w:type="dxa"/>
-              <w:left w:w="100" w:type="dxa"/>
-              <w:bottom w:w="100" w:type="dxa"/>
-              <w:right w:w="100" w:type="dxa"/>
-            </w:tcMar>
-          </w:tcPr>
-          <w:p/>
-        </w:tc>
-      </w:tr>
-      <w:tr>
-        <w:trPr>
-          <w:jc w:val="center"/>
-        </w:trPr>
-        <w:tc>
-          <w:tcPr>
-            <w:tcW w:w="10312" w:type="dxa"/>
-            <w:tcBorders>
-              <w:top w:val="single" w:sz="6" w:space="0" w:color="D8E0E7"/>
-              <w:left w:val="single" w:sz="6" w:space="0" w:color="D8E0E7"/>
-              <w:bottom w:val="single" w:sz="6" w:space="0" w:color="D8E0E7"/>
-              <w:right w:val="single" w:sz="6" w:space="0" w:color="D8E0E7"/>
-            </w:tcBorders>
-            <w:tcMar>
-              <w:top w:w="100" w:type="dxa"/>
-              <w:left w:w="100" w:type="dxa"/>
-              <w:bottom w:w="100" w:type="dxa"/>
-              <w:right w:w="100" w:type="dxa"/>
-            </w:tcMar>
-          </w:tcPr>
-          <w:p/>
-        </w:tc>
-      </w:tr>
-      <w:tr>
-        <w:trPr>
-          <w:jc w:val="center"/>
-        </w:trPr>
-        <w:tc>
-          <w:tcPr>
-            <w:tcW w:w="10312" w:type="dxa"/>
-            <w:tcBorders>
-              <w:top w:val="single" w:sz="6" w:space="0" w:color="D8E0E7"/>
-              <w:left w:val="single" w:sz="6" w:space="0" w:color="D8E0E7"/>
-              <w:bottom w:val="single" w:sz="6" w:space="0" w:color="D8E0E7"/>
-              <w:right w:val="single" w:sz="6" w:space="0" w:color="D8E0E7"/>
-            </w:tcBorders>
-            <w:tcMar>
-              <w:top w:w="100" w:type="dxa"/>
-              <w:left w:w="100" w:type="dxa"/>
-              <w:bottom w:w="100" w:type="dxa"/>
-              <w:right w:w="100" w:type="dxa"/>
-            </w:tcMar>
-          </w:tcPr>
-          <w:p/>
-        </w:tc>
-      </w:tr>
-      <w:tr>
-        <w:trPr>
-          <w:jc w:val="center"/>
-        </w:trPr>
-        <w:tc>
-          <w:tcPr>
-            <w:tcW w:w="10312" w:type="dxa"/>
-            <w:tcBorders>
-              <w:top w:val="single" w:sz="6" w:space="0" w:color="D8E0E7"/>
-              <w:left w:val="single" w:sz="6" w:space="0" w:color="D8E0E7"/>
-              <w:bottom w:val="single" w:sz="6" w:space="0" w:color="D8E0E7"/>
-              <w:right w:val="single" w:sz="6" w:space="0" w:color="D8E0E7"/>
-            </w:tcBorders>
-            <w:tcMar>
-              <w:top w:w="100" w:type="dxa"/>
-              <w:left w:w="100" w:type="dxa"/>
-              <w:bottom w:w="100" w:type="dxa"/>
-              <w:right w:w="100" w:type="dxa"/>
-            </w:tcMar>
-          </w:tcPr>
-          <w:p/>
-        </w:tc>
-      </w:tr>
-      <w:tr>
-        <w:trPr>
-          <w:jc w:val="center"/>
-        </w:trPr>
-        <w:tc>
-          <w:tcPr>
-            <w:tcW w:w="10312" w:type="dxa"/>
-            <w:tcBorders>
-              <w:top w:val="single" w:sz="6" w:space="0" w:color="D8E0E7"/>
-              <w:left w:val="single" w:sz="6" w:space="0" w:color="D8E0E7"/>
-              <w:bottom w:val="single" w:sz="6" w:space="0" w:color="D8E0E7"/>
-              <w:right w:val="single" w:sz="6" w:space="0" w:color="D8E0E7"/>
-            </w:tcBorders>
-            <w:tcMar>
-              <w:top w:w="100" w:type="dxa"/>
-              <w:left w:w="100" w:type="dxa"/>
-              <w:bottom w:w="100" w:type="dxa"/>
-              <w:right w:w="100" w:type="dxa"/>
-            </w:tcMar>
-          </w:tcPr>
-          <w:p/>
+          <w:p>
+            <w:pPr>
+              <w:spacing w:after="0"/>
+            </w:pPr>
+          </w:p>
         </w:tc>
       </w:tr>
     </w:tbl>
+    <w:p>
+      <w:pPr>
+        <w:rPr>
+          <w:b/>
+        </w:rPr>
+      </w:pPr>
+    </w:p>
     <w:p>
       <w:r>
         <w:rPr>
@@ -1330,7 +2909,12 @@
     </w:p>
     <w:p>
       <w:r>
-        <w:t>{/remaining_essay_questions}</w:t>
+        <w:t>{/essays}</w:t>
+      </w:r>
+    </w:p>
+    <w:p>
+      <w:r>
+        <w:br w:type="page"/>
       </w:r>
     </w:p>
     <w:p>
@@ -1342,13 +2926,25 @@
       </w:pPr>
     </w:p>
     <w:p>
+      <w:pPr>
+        <w:rPr>
+          <w:b/>
+          <w:sz w:val="23"/>
+        </w:rPr>
+      </w:pPr>
       <w:r>
         <w:rPr>
           <w:b/>
           <w:sz w:val="23"/>
         </w:rPr>
-        <w:br w:type="page"/>
-        <w:t>Bảng chuẩn đầu ra</w:t>
+        <w:t>B</w:t>
+      </w:r>
+      <w:r>
+        <w:rPr>
+          <w:b/>
+          <w:sz w:val="23"/>
+        </w:rPr>
+        <w:t>ẢNG CHUẨN ĐẦU RA</w:t>
       </w:r>
     </w:p>
     <w:p>
@@ -1379,9 +2975,9 @@
       <w:lvlJc w:val="left"/>
       <w:pPr>
         <w:tabs>
-          <w:tab w:val="num" w:pos="1800"/>
+          <w:tab w:val="num" w:pos="4211"/>
         </w:tabs>
-        <w:ind w:left="1800" w:hanging="360"/>
+        <w:ind w:left="4211" w:hanging="360"/>
       </w:pPr>
     </w:lvl>
   </w:abstractNum>
@@ -1539,32 +3135,641 @@
       </w:rPr>
     </w:lvl>
   </w:abstractNum>
-  <w:num w:numId="1" w16cid:durableId="650064892">
+  <w:abstractNum w:abstractNumId="9" w15:restartNumberingAfterBreak="0">
+    <w:nsid w:val="18A11C67"/>
+    <w:multiLevelType w:val="hybridMultilevel"/>
+    <w:tmpl w:val="81A03DFA"/>
+    <w:lvl w:ilvl="0" w:tplc="0409000F">
+      <w:start w:val="1"/>
+      <w:numFmt w:val="decimal"/>
+      <w:lvlText w:val="%1."/>
+      <w:lvlJc w:val="left"/>
+      <w:pPr>
+        <w:ind w:left="862" w:hanging="360"/>
+      </w:pPr>
+    </w:lvl>
+    <w:lvl w:ilvl="1" w:tplc="04090019" w:tentative="1">
+      <w:start w:val="1"/>
+      <w:numFmt w:val="lowerLetter"/>
+      <w:lvlText w:val="%2."/>
+      <w:lvlJc w:val="left"/>
+      <w:pPr>
+        <w:ind w:left="1582" w:hanging="360"/>
+      </w:pPr>
+    </w:lvl>
+    <w:lvl w:ilvl="2" w:tplc="0409001B" w:tentative="1">
+      <w:start w:val="1"/>
+      <w:numFmt w:val="lowerRoman"/>
+      <w:lvlText w:val="%3."/>
+      <w:lvlJc w:val="right"/>
+      <w:pPr>
+        <w:ind w:left="2302" w:hanging="180"/>
+      </w:pPr>
+    </w:lvl>
+    <w:lvl w:ilvl="3" w:tplc="0409000F" w:tentative="1">
+      <w:start w:val="1"/>
+      <w:numFmt w:val="decimal"/>
+      <w:lvlText w:val="%4."/>
+      <w:lvlJc w:val="left"/>
+      <w:pPr>
+        <w:ind w:left="3022" w:hanging="360"/>
+      </w:pPr>
+    </w:lvl>
+    <w:lvl w:ilvl="4" w:tplc="04090019" w:tentative="1">
+      <w:start w:val="1"/>
+      <w:numFmt w:val="lowerLetter"/>
+      <w:lvlText w:val="%5."/>
+      <w:lvlJc w:val="left"/>
+      <w:pPr>
+        <w:ind w:left="3742" w:hanging="360"/>
+      </w:pPr>
+    </w:lvl>
+    <w:lvl w:ilvl="5" w:tplc="0409001B" w:tentative="1">
+      <w:start w:val="1"/>
+      <w:numFmt w:val="lowerRoman"/>
+      <w:lvlText w:val="%6."/>
+      <w:lvlJc w:val="right"/>
+      <w:pPr>
+        <w:ind w:left="4462" w:hanging="180"/>
+      </w:pPr>
+    </w:lvl>
+    <w:lvl w:ilvl="6" w:tplc="0409000F" w:tentative="1">
+      <w:start w:val="1"/>
+      <w:numFmt w:val="decimal"/>
+      <w:lvlText w:val="%7."/>
+      <w:lvlJc w:val="left"/>
+      <w:pPr>
+        <w:ind w:left="5182" w:hanging="360"/>
+      </w:pPr>
+    </w:lvl>
+    <w:lvl w:ilvl="7" w:tplc="04090019" w:tentative="1">
+      <w:start w:val="1"/>
+      <w:numFmt w:val="lowerLetter"/>
+      <w:lvlText w:val="%8."/>
+      <w:lvlJc w:val="left"/>
+      <w:pPr>
+        <w:ind w:left="5902" w:hanging="360"/>
+      </w:pPr>
+    </w:lvl>
+    <w:lvl w:ilvl="8" w:tplc="0409001B" w:tentative="1">
+      <w:start w:val="1"/>
+      <w:numFmt w:val="lowerRoman"/>
+      <w:lvlText w:val="%9."/>
+      <w:lvlJc w:val="right"/>
+      <w:pPr>
+        <w:ind w:left="6622" w:hanging="180"/>
+      </w:pPr>
+    </w:lvl>
+  </w:abstractNum>
+  <w:abstractNum w:abstractNumId="10" w15:restartNumberingAfterBreak="0">
+    <w:nsid w:val="21A31C75"/>
+    <w:multiLevelType w:val="hybridMultilevel"/>
+    <w:tmpl w:val="D73A7492"/>
+    <w:lvl w:ilvl="0" w:tplc="0409000F">
+      <w:start w:val="1"/>
+      <w:numFmt w:val="decimal"/>
+      <w:lvlText w:val="%1."/>
+      <w:lvlJc w:val="left"/>
+      <w:pPr>
+        <w:ind w:left="720" w:hanging="360"/>
+      </w:pPr>
+    </w:lvl>
+    <w:lvl w:ilvl="1" w:tplc="04090019" w:tentative="1">
+      <w:start w:val="1"/>
+      <w:numFmt w:val="lowerLetter"/>
+      <w:lvlText w:val="%2."/>
+      <w:lvlJc w:val="left"/>
+      <w:pPr>
+        <w:ind w:left="1440" w:hanging="360"/>
+      </w:pPr>
+    </w:lvl>
+    <w:lvl w:ilvl="2" w:tplc="0409001B" w:tentative="1">
+      <w:start w:val="1"/>
+      <w:numFmt w:val="lowerRoman"/>
+      <w:lvlText w:val="%3."/>
+      <w:lvlJc w:val="right"/>
+      <w:pPr>
+        <w:ind w:left="2160" w:hanging="180"/>
+      </w:pPr>
+    </w:lvl>
+    <w:lvl w:ilvl="3" w:tplc="0409000F" w:tentative="1">
+      <w:start w:val="1"/>
+      <w:numFmt w:val="decimal"/>
+      <w:lvlText w:val="%4."/>
+      <w:lvlJc w:val="left"/>
+      <w:pPr>
+        <w:ind w:left="2880" w:hanging="360"/>
+      </w:pPr>
+    </w:lvl>
+    <w:lvl w:ilvl="4" w:tplc="04090019" w:tentative="1">
+      <w:start w:val="1"/>
+      <w:numFmt w:val="lowerLetter"/>
+      <w:lvlText w:val="%5."/>
+      <w:lvlJc w:val="left"/>
+      <w:pPr>
+        <w:ind w:left="3600" w:hanging="360"/>
+      </w:pPr>
+    </w:lvl>
+    <w:lvl w:ilvl="5" w:tplc="0409001B" w:tentative="1">
+      <w:start w:val="1"/>
+      <w:numFmt w:val="lowerRoman"/>
+      <w:lvlText w:val="%6."/>
+      <w:lvlJc w:val="right"/>
+      <w:pPr>
+        <w:ind w:left="4320" w:hanging="180"/>
+      </w:pPr>
+    </w:lvl>
+    <w:lvl w:ilvl="6" w:tplc="0409000F" w:tentative="1">
+      <w:start w:val="1"/>
+      <w:numFmt w:val="decimal"/>
+      <w:lvlText w:val="%7."/>
+      <w:lvlJc w:val="left"/>
+      <w:pPr>
+        <w:ind w:left="5040" w:hanging="360"/>
+      </w:pPr>
+    </w:lvl>
+    <w:lvl w:ilvl="7" w:tplc="04090019" w:tentative="1">
+      <w:start w:val="1"/>
+      <w:numFmt w:val="lowerLetter"/>
+      <w:lvlText w:val="%8."/>
+      <w:lvlJc w:val="left"/>
+      <w:pPr>
+        <w:ind w:left="5760" w:hanging="360"/>
+      </w:pPr>
+    </w:lvl>
+    <w:lvl w:ilvl="8" w:tplc="0409001B" w:tentative="1">
+      <w:start w:val="1"/>
+      <w:numFmt w:val="lowerRoman"/>
+      <w:lvlText w:val="%9."/>
+      <w:lvlJc w:val="right"/>
+      <w:pPr>
+        <w:ind w:left="6480" w:hanging="180"/>
+      </w:pPr>
+    </w:lvl>
+  </w:abstractNum>
+  <w:abstractNum w:abstractNumId="11" w15:restartNumberingAfterBreak="0">
+    <w:nsid w:val="25F7318D"/>
+    <w:multiLevelType w:val="hybridMultilevel"/>
+    <w:tmpl w:val="50868748"/>
+    <w:lvl w:ilvl="0" w:tplc="0409000F">
+      <w:start w:val="1"/>
+      <w:numFmt w:val="decimal"/>
+      <w:lvlText w:val="%1."/>
+      <w:lvlJc w:val="left"/>
+      <w:pPr>
+        <w:ind w:left="720" w:hanging="360"/>
+      </w:pPr>
+      <w:rPr>
+        <w:rFonts w:hint="default"/>
+      </w:rPr>
+    </w:lvl>
+    <w:lvl w:ilvl="1" w:tplc="04090019" w:tentative="1">
+      <w:start w:val="1"/>
+      <w:numFmt w:val="lowerLetter"/>
+      <w:lvlText w:val="%2."/>
+      <w:lvlJc w:val="left"/>
+      <w:pPr>
+        <w:ind w:left="1440" w:hanging="360"/>
+      </w:pPr>
+    </w:lvl>
+    <w:lvl w:ilvl="2" w:tplc="0409001B" w:tentative="1">
+      <w:start w:val="1"/>
+      <w:numFmt w:val="lowerRoman"/>
+      <w:lvlText w:val="%3."/>
+      <w:lvlJc w:val="right"/>
+      <w:pPr>
+        <w:ind w:left="2160" w:hanging="180"/>
+      </w:pPr>
+    </w:lvl>
+    <w:lvl w:ilvl="3" w:tplc="0409000F" w:tentative="1">
+      <w:start w:val="1"/>
+      <w:numFmt w:val="decimal"/>
+      <w:lvlText w:val="%4."/>
+      <w:lvlJc w:val="left"/>
+      <w:pPr>
+        <w:ind w:left="2880" w:hanging="360"/>
+      </w:pPr>
+    </w:lvl>
+    <w:lvl w:ilvl="4" w:tplc="04090019" w:tentative="1">
+      <w:start w:val="1"/>
+      <w:numFmt w:val="lowerLetter"/>
+      <w:lvlText w:val="%5."/>
+      <w:lvlJc w:val="left"/>
+      <w:pPr>
+        <w:ind w:left="3600" w:hanging="360"/>
+      </w:pPr>
+    </w:lvl>
+    <w:lvl w:ilvl="5" w:tplc="0409001B" w:tentative="1">
+      <w:start w:val="1"/>
+      <w:numFmt w:val="lowerRoman"/>
+      <w:lvlText w:val="%6."/>
+      <w:lvlJc w:val="right"/>
+      <w:pPr>
+        <w:ind w:left="4320" w:hanging="180"/>
+      </w:pPr>
+    </w:lvl>
+    <w:lvl w:ilvl="6" w:tplc="0409000F" w:tentative="1">
+      <w:start w:val="1"/>
+      <w:numFmt w:val="decimal"/>
+      <w:lvlText w:val="%7."/>
+      <w:lvlJc w:val="left"/>
+      <w:pPr>
+        <w:ind w:left="5040" w:hanging="360"/>
+      </w:pPr>
+    </w:lvl>
+    <w:lvl w:ilvl="7" w:tplc="04090019" w:tentative="1">
+      <w:start w:val="1"/>
+      <w:numFmt w:val="lowerLetter"/>
+      <w:lvlText w:val="%8."/>
+      <w:lvlJc w:val="left"/>
+      <w:pPr>
+        <w:ind w:left="5760" w:hanging="360"/>
+      </w:pPr>
+    </w:lvl>
+    <w:lvl w:ilvl="8" w:tplc="0409001B" w:tentative="1">
+      <w:start w:val="1"/>
+      <w:numFmt w:val="lowerRoman"/>
+      <w:lvlText w:val="%9."/>
+      <w:lvlJc w:val="right"/>
+      <w:pPr>
+        <w:ind w:left="6480" w:hanging="180"/>
+      </w:pPr>
+    </w:lvl>
+  </w:abstractNum>
+  <w:abstractNum w:abstractNumId="12" w15:restartNumberingAfterBreak="0">
+    <w:nsid w:val="37AD1773"/>
+    <w:multiLevelType w:val="hybridMultilevel"/>
+    <w:tmpl w:val="9C7E23D4"/>
+    <w:lvl w:ilvl="0" w:tplc="F142251E">
+      <w:start w:val="1"/>
+      <w:numFmt w:val="decimal"/>
+      <w:lvlText w:val="%1."/>
+      <w:lvlJc w:val="left"/>
+      <w:pPr>
+        <w:ind w:left="720" w:hanging="360"/>
+      </w:pPr>
+      <w:rPr>
+        <w:rFonts w:hint="default"/>
+        <w:sz w:val="33"/>
+        <w:szCs w:val="33"/>
+      </w:rPr>
+    </w:lvl>
+    <w:lvl w:ilvl="1" w:tplc="04090019" w:tentative="1">
+      <w:start w:val="1"/>
+      <w:numFmt w:val="lowerLetter"/>
+      <w:lvlText w:val="%2."/>
+      <w:lvlJc w:val="left"/>
+      <w:pPr>
+        <w:ind w:left="1440" w:hanging="360"/>
+      </w:pPr>
+    </w:lvl>
+    <w:lvl w:ilvl="2" w:tplc="0409001B" w:tentative="1">
+      <w:start w:val="1"/>
+      <w:numFmt w:val="lowerRoman"/>
+      <w:lvlText w:val="%3."/>
+      <w:lvlJc w:val="right"/>
+      <w:pPr>
+        <w:ind w:left="2160" w:hanging="180"/>
+      </w:pPr>
+    </w:lvl>
+    <w:lvl w:ilvl="3" w:tplc="0409000F" w:tentative="1">
+      <w:start w:val="1"/>
+      <w:numFmt w:val="decimal"/>
+      <w:lvlText w:val="%4."/>
+      <w:lvlJc w:val="left"/>
+      <w:pPr>
+        <w:ind w:left="2880" w:hanging="360"/>
+      </w:pPr>
+    </w:lvl>
+    <w:lvl w:ilvl="4" w:tplc="04090019" w:tentative="1">
+      <w:start w:val="1"/>
+      <w:numFmt w:val="lowerLetter"/>
+      <w:lvlText w:val="%5."/>
+      <w:lvlJc w:val="left"/>
+      <w:pPr>
+        <w:ind w:left="3600" w:hanging="360"/>
+      </w:pPr>
+    </w:lvl>
+    <w:lvl w:ilvl="5" w:tplc="0409001B" w:tentative="1">
+      <w:start w:val="1"/>
+      <w:numFmt w:val="lowerRoman"/>
+      <w:lvlText w:val="%6."/>
+      <w:lvlJc w:val="right"/>
+      <w:pPr>
+        <w:ind w:left="4320" w:hanging="180"/>
+      </w:pPr>
+    </w:lvl>
+    <w:lvl w:ilvl="6" w:tplc="0409000F" w:tentative="1">
+      <w:start w:val="1"/>
+      <w:numFmt w:val="decimal"/>
+      <w:lvlText w:val="%7."/>
+      <w:lvlJc w:val="left"/>
+      <w:pPr>
+        <w:ind w:left="5040" w:hanging="360"/>
+      </w:pPr>
+    </w:lvl>
+    <w:lvl w:ilvl="7" w:tplc="04090019" w:tentative="1">
+      <w:start w:val="1"/>
+      <w:numFmt w:val="lowerLetter"/>
+      <w:lvlText w:val="%8."/>
+      <w:lvlJc w:val="left"/>
+      <w:pPr>
+        <w:ind w:left="5760" w:hanging="360"/>
+      </w:pPr>
+    </w:lvl>
+    <w:lvl w:ilvl="8" w:tplc="0409001B" w:tentative="1">
+      <w:start w:val="1"/>
+      <w:numFmt w:val="lowerRoman"/>
+      <w:lvlText w:val="%9."/>
+      <w:lvlJc w:val="right"/>
+      <w:pPr>
+        <w:ind w:left="6480" w:hanging="180"/>
+      </w:pPr>
+    </w:lvl>
+  </w:abstractNum>
+  <w:abstractNum w:abstractNumId="13" w15:restartNumberingAfterBreak="0">
+    <w:nsid w:val="436E0E6F"/>
+    <w:multiLevelType w:val="hybridMultilevel"/>
+    <w:tmpl w:val="1D047F26"/>
+    <w:lvl w:ilvl="0" w:tplc="BEC6263C">
+      <w:start w:val="1"/>
+      <w:numFmt w:val="decimal"/>
+      <w:lvlText w:val="%1"/>
+      <w:lvlJc w:val="left"/>
+      <w:pPr>
+        <w:ind w:left="396" w:hanging="396"/>
+      </w:pPr>
+      <w:rPr>
+        <w:rFonts w:hint="default"/>
+        <w:sz w:val="28"/>
+      </w:rPr>
+    </w:lvl>
+    <w:lvl w:ilvl="1" w:tplc="04090019" w:tentative="1">
+      <w:start w:val="1"/>
+      <w:numFmt w:val="lowerLetter"/>
+      <w:lvlText w:val="%2."/>
+      <w:lvlJc w:val="left"/>
+      <w:pPr>
+        <w:ind w:left="1152" w:hanging="360"/>
+      </w:pPr>
+    </w:lvl>
+    <w:lvl w:ilvl="2" w:tplc="0409001B" w:tentative="1">
+      <w:start w:val="1"/>
+      <w:numFmt w:val="lowerRoman"/>
+      <w:lvlText w:val="%3."/>
+      <w:lvlJc w:val="right"/>
+      <w:pPr>
+        <w:ind w:left="1872" w:hanging="180"/>
+      </w:pPr>
+    </w:lvl>
+    <w:lvl w:ilvl="3" w:tplc="0409000F" w:tentative="1">
+      <w:start w:val="1"/>
+      <w:numFmt w:val="decimal"/>
+      <w:lvlText w:val="%4."/>
+      <w:lvlJc w:val="left"/>
+      <w:pPr>
+        <w:ind w:left="2592" w:hanging="360"/>
+      </w:pPr>
+    </w:lvl>
+    <w:lvl w:ilvl="4" w:tplc="04090019" w:tentative="1">
+      <w:start w:val="1"/>
+      <w:numFmt w:val="lowerLetter"/>
+      <w:lvlText w:val="%5."/>
+      <w:lvlJc w:val="left"/>
+      <w:pPr>
+        <w:ind w:left="3312" w:hanging="360"/>
+      </w:pPr>
+    </w:lvl>
+    <w:lvl w:ilvl="5" w:tplc="0409001B" w:tentative="1">
+      <w:start w:val="1"/>
+      <w:numFmt w:val="lowerRoman"/>
+      <w:lvlText w:val="%6."/>
+      <w:lvlJc w:val="right"/>
+      <w:pPr>
+        <w:ind w:left="4032" w:hanging="180"/>
+      </w:pPr>
+    </w:lvl>
+    <w:lvl w:ilvl="6" w:tplc="0409000F" w:tentative="1">
+      <w:start w:val="1"/>
+      <w:numFmt w:val="decimal"/>
+      <w:lvlText w:val="%7."/>
+      <w:lvlJc w:val="left"/>
+      <w:pPr>
+        <w:ind w:left="4752" w:hanging="360"/>
+      </w:pPr>
+    </w:lvl>
+    <w:lvl w:ilvl="7" w:tplc="04090019" w:tentative="1">
+      <w:start w:val="1"/>
+      <w:numFmt w:val="lowerLetter"/>
+      <w:lvlText w:val="%8."/>
+      <w:lvlJc w:val="left"/>
+      <w:pPr>
+        <w:ind w:left="5472" w:hanging="360"/>
+      </w:pPr>
+    </w:lvl>
+    <w:lvl w:ilvl="8" w:tplc="0409001B" w:tentative="1">
+      <w:start w:val="1"/>
+      <w:numFmt w:val="lowerRoman"/>
+      <w:lvlText w:val="%9."/>
+      <w:lvlJc w:val="right"/>
+      <w:pPr>
+        <w:ind w:left="6192" w:hanging="180"/>
+      </w:pPr>
+    </w:lvl>
+  </w:abstractNum>
+  <w:abstractNum w:abstractNumId="14" w15:restartNumberingAfterBreak="0">
+    <w:nsid w:val="54DC49C9"/>
+    <w:multiLevelType w:val="multilevel"/>
+    <w:tmpl w:val="C7082ED4"/>
+    <w:lvl w:ilvl="0">
+      <w:start w:val="1"/>
+      <w:numFmt w:val="bullet"/>
+      <w:lvlText w:val=""/>
+      <w:lvlJc w:val="left"/>
+      <w:pPr>
+        <w:tabs>
+          <w:tab w:val="num" w:pos="720"/>
+        </w:tabs>
+        <w:ind w:left="720" w:hanging="360"/>
+      </w:pPr>
+      <w:rPr>
+        <w:rFonts w:ascii="Symbol" w:hAnsi="Symbol" w:hint="default"/>
+        <w:sz w:val="20"/>
+      </w:rPr>
+    </w:lvl>
+    <w:lvl w:ilvl="1" w:tentative="1">
+      <w:start w:val="1"/>
+      <w:numFmt w:val="bullet"/>
+      <w:lvlText w:val="o"/>
+      <w:lvlJc w:val="left"/>
+      <w:pPr>
+        <w:tabs>
+          <w:tab w:val="num" w:pos="1440"/>
+        </w:tabs>
+        <w:ind w:left="1440" w:hanging="360"/>
+      </w:pPr>
+      <w:rPr>
+        <w:rFonts w:ascii="Courier New" w:hAnsi="Courier New" w:hint="default"/>
+        <w:sz w:val="20"/>
+      </w:rPr>
+    </w:lvl>
+    <w:lvl w:ilvl="2" w:tentative="1">
+      <w:start w:val="1"/>
+      <w:numFmt w:val="bullet"/>
+      <w:lvlText w:val=""/>
+      <w:lvlJc w:val="left"/>
+      <w:pPr>
+        <w:tabs>
+          <w:tab w:val="num" w:pos="2160"/>
+        </w:tabs>
+        <w:ind w:left="2160" w:hanging="360"/>
+      </w:pPr>
+      <w:rPr>
+        <w:rFonts w:ascii="Wingdings" w:hAnsi="Wingdings" w:hint="default"/>
+        <w:sz w:val="20"/>
+      </w:rPr>
+    </w:lvl>
+    <w:lvl w:ilvl="3" w:tentative="1">
+      <w:start w:val="1"/>
+      <w:numFmt w:val="bullet"/>
+      <w:lvlText w:val=""/>
+      <w:lvlJc w:val="left"/>
+      <w:pPr>
+        <w:tabs>
+          <w:tab w:val="num" w:pos="2880"/>
+        </w:tabs>
+        <w:ind w:left="2880" w:hanging="360"/>
+      </w:pPr>
+      <w:rPr>
+        <w:rFonts w:ascii="Wingdings" w:hAnsi="Wingdings" w:hint="default"/>
+        <w:sz w:val="20"/>
+      </w:rPr>
+    </w:lvl>
+    <w:lvl w:ilvl="4" w:tentative="1">
+      <w:start w:val="1"/>
+      <w:numFmt w:val="bullet"/>
+      <w:lvlText w:val=""/>
+      <w:lvlJc w:val="left"/>
+      <w:pPr>
+        <w:tabs>
+          <w:tab w:val="num" w:pos="3600"/>
+        </w:tabs>
+        <w:ind w:left="3600" w:hanging="360"/>
+      </w:pPr>
+      <w:rPr>
+        <w:rFonts w:ascii="Wingdings" w:hAnsi="Wingdings" w:hint="default"/>
+        <w:sz w:val="20"/>
+      </w:rPr>
+    </w:lvl>
+    <w:lvl w:ilvl="5" w:tentative="1">
+      <w:start w:val="1"/>
+      <w:numFmt w:val="bullet"/>
+      <w:lvlText w:val=""/>
+      <w:lvlJc w:val="left"/>
+      <w:pPr>
+        <w:tabs>
+          <w:tab w:val="num" w:pos="4320"/>
+        </w:tabs>
+        <w:ind w:left="4320" w:hanging="360"/>
+      </w:pPr>
+      <w:rPr>
+        <w:rFonts w:ascii="Wingdings" w:hAnsi="Wingdings" w:hint="default"/>
+        <w:sz w:val="20"/>
+      </w:rPr>
+    </w:lvl>
+    <w:lvl w:ilvl="6" w:tentative="1">
+      <w:start w:val="1"/>
+      <w:numFmt w:val="bullet"/>
+      <w:lvlText w:val=""/>
+      <w:lvlJc w:val="left"/>
+      <w:pPr>
+        <w:tabs>
+          <w:tab w:val="num" w:pos="5040"/>
+        </w:tabs>
+        <w:ind w:left="5040" w:hanging="360"/>
+      </w:pPr>
+      <w:rPr>
+        <w:rFonts w:ascii="Wingdings" w:hAnsi="Wingdings" w:hint="default"/>
+        <w:sz w:val="20"/>
+      </w:rPr>
+    </w:lvl>
+    <w:lvl w:ilvl="7" w:tentative="1">
+      <w:start w:val="1"/>
+      <w:numFmt w:val="bullet"/>
+      <w:lvlText w:val=""/>
+      <w:lvlJc w:val="left"/>
+      <w:pPr>
+        <w:tabs>
+          <w:tab w:val="num" w:pos="5760"/>
+        </w:tabs>
+        <w:ind w:left="5760" w:hanging="360"/>
+      </w:pPr>
+      <w:rPr>
+        <w:rFonts w:ascii="Wingdings" w:hAnsi="Wingdings" w:hint="default"/>
+        <w:sz w:val="20"/>
+      </w:rPr>
+    </w:lvl>
+    <w:lvl w:ilvl="8" w:tentative="1">
+      <w:start w:val="1"/>
+      <w:numFmt w:val="bullet"/>
+      <w:lvlText w:val=""/>
+      <w:lvlJc w:val="left"/>
+      <w:pPr>
+        <w:tabs>
+          <w:tab w:val="num" w:pos="6480"/>
+        </w:tabs>
+        <w:ind w:left="6480" w:hanging="360"/>
+      </w:pPr>
+      <w:rPr>
+        <w:rFonts w:ascii="Wingdings" w:hAnsi="Wingdings" w:hint="default"/>
+        <w:sz w:val="20"/>
+      </w:rPr>
+    </w:lvl>
+  </w:abstractNum>
+  <w:num w:numId="1" w16cid:durableId="1308168242">
     <w:abstractNumId w:val="8"/>
   </w:num>
-  <w:num w:numId="2" w16cid:durableId="1423144044">
+  <w:num w:numId="2" w16cid:durableId="1117719327">
     <w:abstractNumId w:val="6"/>
   </w:num>
-  <w:num w:numId="3" w16cid:durableId="1734035588">
+  <w:num w:numId="3" w16cid:durableId="1899974633">
     <w:abstractNumId w:val="5"/>
   </w:num>
-  <w:num w:numId="4" w16cid:durableId="1974362195">
+  <w:num w:numId="4" w16cid:durableId="890652903">
     <w:abstractNumId w:val="4"/>
   </w:num>
-  <w:num w:numId="5" w16cid:durableId="1014381576">
+  <w:num w:numId="5" w16cid:durableId="1500733494">
     <w:abstractNumId w:val="7"/>
   </w:num>
-  <w:num w:numId="6" w16cid:durableId="968558029">
+  <w:num w:numId="6" w16cid:durableId="1536037797">
     <w:abstractNumId w:val="3"/>
   </w:num>
-  <w:num w:numId="7" w16cid:durableId="469245442">
+  <w:num w:numId="7" w16cid:durableId="1521120812">
     <w:abstractNumId w:val="2"/>
   </w:num>
-  <w:num w:numId="8" w16cid:durableId="1723285093">
+  <w:num w:numId="8" w16cid:durableId="1346786930">
     <w:abstractNumId w:val="1"/>
   </w:num>
-  <w:num w:numId="9" w16cid:durableId="1316643847">
+  <w:num w:numId="9" w16cid:durableId="105776661">
     <w:abstractNumId w:val="0"/>
+  </w:num>
+  <w:num w:numId="10" w16cid:durableId="2009356833">
+    <w:abstractNumId w:val="14"/>
+  </w:num>
+  <w:num w:numId="11" w16cid:durableId="1162890696">
+    <w:abstractNumId w:val="11"/>
+  </w:num>
+  <w:num w:numId="12" w16cid:durableId="573777264">
+    <w:abstractNumId w:val="12"/>
+  </w:num>
+  <w:num w:numId="13" w16cid:durableId="1000812370">
+    <w:abstractNumId w:val="9"/>
+  </w:num>
+  <w:num w:numId="14" w16cid:durableId="61947228">
+    <w:abstractNumId w:val="10"/>
+  </w:num>
+  <w:num w:numId="15" w16cid:durableId="430005583">
+    <w:abstractNumId w:val="13"/>
   </w:num>
 </w:numbering>
 </file>
@@ -1958,7 +4163,7 @@
   <w:style w:type="paragraph" w:default="1" w:styleId="Normal">
     <w:name w:val="Normal"/>
     <w:qFormat/>
-    <w:rsid w:val="00FC693F"/>
+    <w:rsid w:val="00F43092"/>
     <w:pPr>
       <w:spacing w:after="80"/>
     </w:pPr>

</xml_diff>